<commit_message>
Remove redundant PROJECT_REPORT.md, keep the Word version as canonical
The Markdown and Word versions of the evaluation report duplicated each
other; the Word version stays, the Markdown copy and its cross-references
in ACCURACY.md are removed.

Co-Authored-By: Claude Sonnet 5 <noreply@anthropic.com>
</commit_message>
<xml_diff>
--- a/ProjectEvaluationReport.docx
+++ b/ProjectEvaluationReport.docx
@@ -2835,7 +2835,23 @@
           <w:sz w:val="24"/>
           <w:szCs w:val="24"/>
         </w:rPr>
-        <w:t>, a deliberate narrowing from an earlier two-council build that included Inner West (Marrickville, Ashfield). This report covers the full project arc: the original problem and motivation, how the backend</w:t>
+        <w:t>, a deliberate narrowing from an earlier two-council build that included Inner West (</w:t>
+      </w:r>
+      <w:proofErr w:type="spellStart"/>
+      <w:r>
+        <w:rPr>
+          <w:sz w:val="24"/>
+          <w:szCs w:val="24"/>
+        </w:rPr>
+        <w:t>Marrickville</w:t>
+      </w:r>
+      <w:proofErr w:type="spellEnd"/>
+      <w:r>
+        <w:rPr>
+          <w:sz w:val="24"/>
+          <w:szCs w:val="24"/>
+        </w:rPr>
+        <w:t>, Ashfield). This report covers the full project arc: the original problem and motivation, how the backend</w:t>
       </w:r>
       <w:r>
         <w:rPr>
@@ -3353,35 +3369,36 @@
           <w:sz w:val="19"/>
         </w:rPr>
         <w:br/>
-        <w:t>NSW ArcGIS Geocoder ----&gt; lat/lon</w:t>
-      </w:r>
+        <w:t xml:space="preserve">NSW ArcGIS Geocoder ----&gt; </w:t>
+      </w:r>
+      <w:proofErr w:type="spellStart"/>
       <w:r>
         <w:rPr>
           <w:rFonts w:ascii="Consolas" w:hAnsi="Consolas"/>
           <w:color w:val="333333"/>
           <w:sz w:val="19"/>
         </w:rPr>
-        <w:br/>
-        <w:t xml:space="preserve">  |</w:t>
-      </w:r>
+        <w:t>lat</w:t>
+      </w:r>
+      <w:proofErr w:type="spellEnd"/>
       <w:r>
         <w:rPr>
           <w:rFonts w:ascii="Consolas" w:hAnsi="Consolas"/>
           <w:color w:val="333333"/>
           <w:sz w:val="19"/>
         </w:rPr>
-        <w:br/>
-        <w:t xml:space="preserve">  v</w:t>
-      </w:r>
+        <w:t>/</w:t>
+      </w:r>
+      <w:proofErr w:type="spellStart"/>
       <w:r>
         <w:rPr>
           <w:rFonts w:ascii="Consolas" w:hAnsi="Consolas"/>
           <w:color w:val="333333"/>
           <w:sz w:val="19"/>
         </w:rPr>
-        <w:br/>
-        <w:t>NSW Cadastre API ----&gt; lot polygon (GeoJSON)</w:t>
-      </w:r>
+        <w:t>lon</w:t>
+      </w:r>
+      <w:proofErr w:type="spellEnd"/>
       <w:r>
         <w:rPr>
           <w:rFonts w:ascii="Consolas" w:hAnsi="Consolas"/>
@@ -3389,7 +3406,7 @@
           <w:sz w:val="19"/>
         </w:rPr>
         <w:br/>
-        <w:t>NSW Planning API ----&gt; zone, LGA</w:t>
+        <w:t xml:space="preserve">  |</w:t>
       </w:r>
       <w:r>
         <w:rPr>
@@ -3398,7 +3415,7 @@
           <w:sz w:val="19"/>
         </w:rPr>
         <w:br/>
-        <w:t>NSW LEP Map Layers ----&gt; FSR, height-of-building, min lot size, heritage (live, per-lot)</w:t>
+        <w:t xml:space="preserve">  v</w:t>
       </w:r>
       <w:r>
         <w:rPr>
@@ -3407,43 +3424,43 @@
           <w:sz w:val="19"/>
         </w:rPr>
         <w:br/>
-        <w:t xml:space="preserve">  |</w:t>
-      </w:r>
+        <w:t xml:space="preserve">NSW </w:t>
+      </w:r>
+      <w:proofErr w:type="spellStart"/>
       <w:r>
         <w:rPr>
           <w:rFonts w:ascii="Consolas" w:hAnsi="Consolas"/>
           <w:color w:val="333333"/>
           <w:sz w:val="19"/>
         </w:rPr>
-        <w:br/>
-        <w:t xml:space="preserve">  v</w:t>
-      </w:r>
+        <w:t>Cadastre</w:t>
+      </w:r>
+      <w:proofErr w:type="spellEnd"/>
       <w:r>
         <w:rPr>
           <w:rFonts w:ascii="Consolas" w:hAnsi="Consolas"/>
           <w:color w:val="333333"/>
           <w:sz w:val="19"/>
         </w:rPr>
-        <w:br/>
-        <w:t>Rule lookup (DCP + LEP + SEPP, filtered by zone/dwelling type)</w:t>
-      </w:r>
+        <w:t xml:space="preserve"> API ----&gt; lot polygon (</w:t>
+      </w:r>
+      <w:proofErr w:type="spellStart"/>
       <w:r>
         <w:rPr>
           <w:rFonts w:ascii="Consolas" w:hAnsi="Consolas"/>
           <w:color w:val="333333"/>
           <w:sz w:val="19"/>
         </w:rPr>
-        <w:br/>
-        <w:t xml:space="preserve">  |</w:t>
-      </w:r>
+        <w:t>GeoJSON</w:t>
+      </w:r>
+      <w:proofErr w:type="spellEnd"/>
       <w:r>
         <w:rPr>
           <w:rFonts w:ascii="Consolas" w:hAnsi="Consolas"/>
           <w:color w:val="333333"/>
           <w:sz w:val="19"/>
         </w:rPr>
-        <w:br/>
-        <w:t xml:space="preserve">  v</w:t>
+        <w:t>)</w:t>
       </w:r>
       <w:r>
         <w:rPr>
@@ -3452,7 +3469,7 @@
           <w:sz w:val="19"/>
         </w:rPr>
         <w:br/>
-        <w:t>compute_envelope() ----&gt; buildable footprint polygon + citations</w:t>
+        <w:t>NSW Planning API ----&gt; zone, LGA</w:t>
       </w:r>
       <w:r>
         <w:rPr>
@@ -3461,7 +3478,7 @@
           <w:sz w:val="19"/>
         </w:rPr>
         <w:br/>
-        <w:t xml:space="preserve">  |</w:t>
+        <w:t>NSW LEP Map Layers ----&gt; FSR, height-of-building, min lot size, heritage (live, per-lot)</w:t>
       </w:r>
       <w:r>
         <w:rPr>
@@ -3470,7 +3487,7 @@
           <w:sz w:val="19"/>
         </w:rPr>
         <w:br/>
-        <w:t xml:space="preserve">  v</w:t>
+        <w:t xml:space="preserve">  |</w:t>
       </w:r>
       <w:r>
         <w:rPr>
@@ -3479,7 +3496,122 @@
           <w:sz w:val="19"/>
         </w:rPr>
         <w:br/>
-        <w:t>FastAPI JSON response ----&gt; frontend map UI / Grasshopper plugin</w:t>
+        <w:t xml:space="preserve">  v</w:t>
+      </w:r>
+      <w:r>
+        <w:rPr>
+          <w:rFonts w:ascii="Consolas" w:hAnsi="Consolas"/>
+          <w:color w:val="333333"/>
+          <w:sz w:val="19"/>
+        </w:rPr>
+        <w:br/>
+        <w:t>Rule lookup (DCP + LEP + SEPP, filtered by zone/dwelling type)</w:t>
+      </w:r>
+      <w:r>
+        <w:rPr>
+          <w:rFonts w:ascii="Consolas" w:hAnsi="Consolas"/>
+          <w:color w:val="333333"/>
+          <w:sz w:val="19"/>
+        </w:rPr>
+        <w:br/>
+        <w:t xml:space="preserve">  |</w:t>
+      </w:r>
+      <w:r>
+        <w:rPr>
+          <w:rFonts w:ascii="Consolas" w:hAnsi="Consolas"/>
+          <w:color w:val="333333"/>
+          <w:sz w:val="19"/>
+        </w:rPr>
+        <w:br/>
+        <w:t xml:space="preserve">  v</w:t>
+      </w:r>
+      <w:r>
+        <w:rPr>
+          <w:rFonts w:ascii="Consolas" w:hAnsi="Consolas"/>
+          <w:color w:val="333333"/>
+          <w:sz w:val="19"/>
+        </w:rPr>
+        <w:br/>
+      </w:r>
+      <w:proofErr w:type="spellStart"/>
+      <w:r>
+        <w:rPr>
+          <w:rFonts w:ascii="Consolas" w:hAnsi="Consolas"/>
+          <w:color w:val="333333"/>
+          <w:sz w:val="19"/>
+        </w:rPr>
+        <w:t>compute_</w:t>
+      </w:r>
+      <w:proofErr w:type="gramStart"/>
+      <w:r>
+        <w:rPr>
+          <w:rFonts w:ascii="Consolas" w:hAnsi="Consolas"/>
+          <w:color w:val="333333"/>
+          <w:sz w:val="19"/>
+        </w:rPr>
+        <w:t>envelope</w:t>
+      </w:r>
+      <w:proofErr w:type="spellEnd"/>
+      <w:r>
+        <w:rPr>
+          <w:rFonts w:ascii="Consolas" w:hAnsi="Consolas"/>
+          <w:color w:val="333333"/>
+          <w:sz w:val="19"/>
+        </w:rPr>
+        <w:t>(</w:t>
+      </w:r>
+      <w:proofErr w:type="gramEnd"/>
+      <w:r>
+        <w:rPr>
+          <w:rFonts w:ascii="Consolas" w:hAnsi="Consolas"/>
+          <w:color w:val="333333"/>
+          <w:sz w:val="19"/>
+        </w:rPr>
+        <w:t>) ----&gt; buildable footprint polygon + citations</w:t>
+      </w:r>
+      <w:r>
+        <w:rPr>
+          <w:rFonts w:ascii="Consolas" w:hAnsi="Consolas"/>
+          <w:color w:val="333333"/>
+          <w:sz w:val="19"/>
+        </w:rPr>
+        <w:br/>
+        <w:t xml:space="preserve">  |</w:t>
+      </w:r>
+      <w:r>
+        <w:rPr>
+          <w:rFonts w:ascii="Consolas" w:hAnsi="Consolas"/>
+          <w:color w:val="333333"/>
+          <w:sz w:val="19"/>
+        </w:rPr>
+        <w:br/>
+        <w:t xml:space="preserve">  v</w:t>
+      </w:r>
+      <w:r>
+        <w:rPr>
+          <w:rFonts w:ascii="Consolas" w:hAnsi="Consolas"/>
+          <w:color w:val="333333"/>
+          <w:sz w:val="19"/>
+        </w:rPr>
+        <w:br/>
+      </w:r>
+      <w:proofErr w:type="spellStart"/>
+      <w:r>
+        <w:rPr>
+          <w:rFonts w:ascii="Consolas" w:hAnsi="Consolas"/>
+          <w:color w:val="333333"/>
+          <w:sz w:val="19"/>
+        </w:rPr>
+        <w:t>FastAPI</w:t>
+      </w:r>
+      <w:proofErr w:type="spellEnd"/>
+      <w:r>
+        <w:rPr>
+          <w:rFonts w:ascii="Consolas" w:hAnsi="Consolas"/>
+          <w:color w:val="333333"/>
+          <w:sz w:val="19"/>
+        </w:rPr>
+        <w:t xml:space="preserve"> JSON response ----&gt; frontend map UI / Grasshopper plugin</w:t>
       </w:r>
     </w:p>
     <w:p>
@@ -3511,7 +3643,23 @@
           <w:sz w:val="24"/>
           <w:szCs w:val="24"/>
         </w:rPr>
-        <w:t xml:space="preserve"> all external API integration: ArcGIS geocoding and autocomplete, NSW Six Maps cadastre (lot polygons), NSW Planning spatial layers (zone, LGA, FSR, height, lot size, heritage), NSW Transport road-segment layer (used for corner-lot frontage detection).</w:t>
+        <w:t xml:space="preserve"> all external API integration: ArcGIS geocoding and autocomplete, NSW Six Maps </w:t>
+      </w:r>
+      <w:proofErr w:type="spellStart"/>
+      <w:r>
+        <w:rPr>
+          <w:sz w:val="24"/>
+          <w:szCs w:val="24"/>
+        </w:rPr>
+        <w:t>cadastre</w:t>
+      </w:r>
+      <w:proofErr w:type="spellEnd"/>
+      <w:r>
+        <w:rPr>
+          <w:sz w:val="24"/>
+          <w:szCs w:val="24"/>
+        </w:rPr>
+        <w:t xml:space="preserve"> (lot polygons), NSW Planning spatial layers (zone, LGA, FSR, height, lot size, heritage), NSW Transport road-segment layer (used for corner-lot frontage detection).</w:t>
       </w:r>
     </w:p>
     <w:p>
@@ -3543,7 +3691,23 @@
           <w:sz w:val="24"/>
           <w:szCs w:val="24"/>
         </w:rPr>
-        <w:t xml:space="preserve"> the geometry engine. Takes a lot polygon and a filtered rule set and produces a clipped buildable-envelope polygon.</w:t>
+        <w:t xml:space="preserve"> the geometry engine. Takes a </w:t>
+      </w:r>
+      <w:proofErr w:type="gramStart"/>
+      <w:r>
+        <w:rPr>
+          <w:sz w:val="24"/>
+          <w:szCs w:val="24"/>
+        </w:rPr>
+        <w:t>lot</w:t>
+      </w:r>
+      <w:proofErr w:type="gramEnd"/>
+      <w:r>
+        <w:rPr>
+          <w:sz w:val="24"/>
+          <w:szCs w:val="24"/>
+        </w:rPr>
+        <w:t xml:space="preserve"> polygon and a filtered rule set and produces a clipped buildable-envelope polygon.</w:t>
       </w:r>
     </w:p>
     <w:p>
@@ -3575,7 +3739,39 @@
           <w:sz w:val="24"/>
           <w:szCs w:val="24"/>
         </w:rPr>
-        <w:t xml:space="preserve"> Housing SEPP 2021 Ch6 LMR eligibility: zone check, spatial distance-to-town-centre check (walking distance via NSW Town Centres Map), dimensional checks (min lot size/width).</w:t>
+        <w:t xml:space="preserve"> Housing SEPP 2021 Ch6 LMR eligibility: zone check, spatial distance-to-town-</w:t>
+      </w:r>
+      <w:proofErr w:type="spellStart"/>
+      <w:r>
+        <w:rPr>
+          <w:sz w:val="24"/>
+          <w:szCs w:val="24"/>
+        </w:rPr>
+        <w:t>centre</w:t>
+      </w:r>
+      <w:proofErr w:type="spellEnd"/>
+      <w:r>
+        <w:rPr>
+          <w:sz w:val="24"/>
+          <w:szCs w:val="24"/>
+        </w:rPr>
+        <w:t xml:space="preserve"> check (walking distance via NSW Town </w:t>
+      </w:r>
+      <w:proofErr w:type="spellStart"/>
+      <w:r>
+        <w:rPr>
+          <w:sz w:val="24"/>
+          <w:szCs w:val="24"/>
+        </w:rPr>
+        <w:t>Centres</w:t>
+      </w:r>
+      <w:proofErr w:type="spellEnd"/>
+      <w:r>
+        <w:rPr>
+          <w:sz w:val="24"/>
+          <w:szCs w:val="24"/>
+        </w:rPr>
+        <w:t xml:space="preserve"> Map), dimensional checks (min lot size/width).</w:t>
       </w:r>
     </w:p>
     <w:p>
@@ -3607,7 +3803,23 @@
           <w:sz w:val="24"/>
           <w:szCs w:val="24"/>
         </w:rPr>
-        <w:t xml:space="preserve"> FastAPI app; wires the above together into </w:t>
+        <w:t xml:space="preserve"> </w:t>
+      </w:r>
+      <w:proofErr w:type="spellStart"/>
+      <w:r>
+        <w:rPr>
+          <w:sz w:val="24"/>
+          <w:szCs w:val="24"/>
+        </w:rPr>
+        <w:t>FastAPI</w:t>
+      </w:r>
+      <w:proofErr w:type="spellEnd"/>
+      <w:r>
+        <w:rPr>
+          <w:sz w:val="24"/>
+          <w:szCs w:val="24"/>
+        </w:rPr>
+        <w:t xml:space="preserve"> app; wires the above together into </w:t>
       </w:r>
       <w:r>
         <w:rPr>
@@ -3645,7 +3857,25 @@
           <w:sz w:val="24"/>
           <w:szCs w:val="24"/>
         </w:rPr>
-        <w:t>/cdc-eligibility</w:t>
+        <w:t>/</w:t>
+      </w:r>
+      <w:proofErr w:type="spellStart"/>
+      <w:r>
+        <w:rPr>
+          <w:rFonts w:ascii="Consolas" w:hAnsi="Consolas"/>
+          <w:sz w:val="24"/>
+          <w:szCs w:val="24"/>
+        </w:rPr>
+        <w:t>cdc</w:t>
+      </w:r>
+      <w:proofErr w:type="spellEnd"/>
+      <w:r>
+        <w:rPr>
+          <w:rFonts w:ascii="Consolas" w:hAnsi="Consolas"/>
+          <w:sz w:val="24"/>
+          <w:szCs w:val="24"/>
+        </w:rPr>
+        <w:t>-eligibility</w:t>
       </w:r>
       <w:r>
         <w:rPr>
@@ -3660,8 +3890,18 @@
           <w:sz w:val="24"/>
           <w:szCs w:val="24"/>
         </w:rPr>
-        <w:t>/lmr</w:t>
-      </w:r>
+        <w:t>/</w:t>
+      </w:r>
+      <w:proofErr w:type="spellStart"/>
+      <w:r>
+        <w:rPr>
+          <w:rFonts w:ascii="Consolas" w:hAnsi="Consolas"/>
+          <w:sz w:val="24"/>
+          <w:szCs w:val="24"/>
+        </w:rPr>
+        <w:t>lmr</w:t>
+      </w:r>
+      <w:proofErr w:type="spellEnd"/>
       <w:r>
         <w:rPr>
           <w:sz w:val="24"/>
@@ -3744,8 +3984,17 @@
           <w:sz w:val="24"/>
           <w:szCs w:val="24"/>
         </w:rPr>
-        <w:t xml:space="preserve"> the LLM-driven rule extraction pipeline:</w:t>
-      </w:r>
+        <w:t xml:space="preserve"> the LLM-driven rule extraction </w:t>
+      </w:r>
+      <w:proofErr w:type="gramStart"/>
+      <w:r>
+        <w:rPr>
+          <w:sz w:val="24"/>
+          <w:szCs w:val="24"/>
+        </w:rPr>
+        <w:t>pipeline:</w:t>
+      </w:r>
+      <w:proofErr w:type="gramEnd"/>
       <w:r>
         <w:rPr>
           <w:sz w:val="24"/>
@@ -3794,7 +4043,23 @@
           <w:sz w:val="24"/>
           <w:szCs w:val="24"/>
         </w:rPr>
-        <w:t xml:space="preserve"> a Grasshopper definition with a Python component that calls the same FastAPI backend an architect would otherwise hit via the web UI.</w:t>
+        <w:t xml:space="preserve"> a Grasshopper definition with a Python component that calls the same </w:t>
+      </w:r>
+      <w:proofErr w:type="spellStart"/>
+      <w:r>
+        <w:rPr>
+          <w:sz w:val="24"/>
+          <w:szCs w:val="24"/>
+        </w:rPr>
+        <w:t>FastAPI</w:t>
+      </w:r>
+      <w:proofErr w:type="spellEnd"/>
+      <w:r>
+        <w:rPr>
+          <w:sz w:val="24"/>
+          <w:szCs w:val="24"/>
+        </w:rPr>
+        <w:t xml:space="preserve"> backend an architect would otherwise hit via the web UI.</w:t>
       </w:r>
     </w:p>
     <w:p>
@@ -3843,7 +4108,23 @@
           <w:sz w:val="24"/>
           <w:szCs w:val="24"/>
         </w:rPr>
-        <w:t>Converts the backend's GeoJSON lot/envelope polygons into real Rhino curves, extrudes a 3D mass from the envelope up to the height limit, and surfaces citations, LMR info, and development controls as labelled outputs directly in the Rhino viewport.</w:t>
+        <w:t xml:space="preserve">Converts the backend's </w:t>
+      </w:r>
+      <w:proofErr w:type="spellStart"/>
+      <w:r>
+        <w:rPr>
+          <w:sz w:val="24"/>
+          <w:szCs w:val="24"/>
+        </w:rPr>
+        <w:t>GeoJSON</w:t>
+      </w:r>
+      <w:proofErr w:type="spellEnd"/>
+      <w:r>
+        <w:rPr>
+          <w:sz w:val="24"/>
+          <w:szCs w:val="24"/>
+        </w:rPr>
+        <w:t xml:space="preserve"> lot/envelope polygons into real Rhino curves, extrudes a 3D mass from the envelope up to the height limit, and surfaces citations, LMR info, and development controls as labelled outputs directly in the Rhino viewport.</w:t>
       </w:r>
     </w:p>
     <w:p>
@@ -3884,13 +4165,23 @@
         </w:rPr>
         <w:t xml:space="preserve"> Every number an architect sees in Rhino traces back to the same </w:t>
       </w:r>
+      <w:proofErr w:type="spellStart"/>
       <w:r>
         <w:rPr>
           <w:rFonts w:ascii="Consolas" w:hAnsi="Consolas"/>
           <w:sz w:val="24"/>
           <w:szCs w:val="24"/>
         </w:rPr>
-        <w:t>compute_envelope ()</w:t>
+        <w:t>compute_envelope</w:t>
+      </w:r>
+      <w:proofErr w:type="spellEnd"/>
+      <w:r>
+        <w:rPr>
+          <w:rFonts w:ascii="Consolas" w:hAnsi="Consolas"/>
+          <w:sz w:val="24"/>
+          <w:szCs w:val="24"/>
+        </w:rPr>
+        <w:t xml:space="preserve"> ()</w:t>
       </w:r>
       <w:r>
         <w:rPr>
@@ -4278,12 +4569,21 @@
                 <w:szCs w:val="24"/>
               </w:rPr>
             </w:pPr>
+            <w:proofErr w:type="spellStart"/>
             <w:r>
               <w:rPr>
                 <w:sz w:val="24"/>
                 <w:szCs w:val="24"/>
               </w:rPr>
-              <w:t>FastAPI backend live (</w:t>
+              <w:t>FastAPI</w:t>
+            </w:r>
+            <w:proofErr w:type="spellEnd"/>
+            <w:r>
+              <w:rPr>
+                <w:sz w:val="24"/>
+                <w:szCs w:val="24"/>
+              </w:rPr>
+              <w:t xml:space="preserve"> backend live (</w:t>
             </w:r>
             <w:r>
               <w:rPr>
@@ -4505,6 +4805,7 @@
                 <w:szCs w:val="24"/>
                 <w:lang w:val="en-AU"/>
               </w:rPr>
+              <w:lastRenderedPageBreak/>
               <w:t>Day 10 - 14</w:t>
             </w:r>
           </w:p>
@@ -4530,14 +4831,59 @@
               </w:rPr>
               <w:t xml:space="preserve">Grasshopper Python component; </w:t>
             </w:r>
+            <w:proofErr w:type="spellStart"/>
             <w:r>
               <w:rPr>
                 <w:sz w:val="24"/>
                 <w:szCs w:val="24"/>
                 <w:lang w:val="en-AU"/>
               </w:rPr>
-              <w:lastRenderedPageBreak/>
-              <w:t>GeoJSON→Rhino curve conversion; 7-output layout; envelope area=0 bug; GH/Rhino context bug; pre-Demo fixes (response normalization, lat/lon handling)</w:t>
+              <w:t>GeoJSON→Rhino</w:t>
+            </w:r>
+            <w:proofErr w:type="spellEnd"/>
+            <w:r>
+              <w:rPr>
+                <w:sz w:val="24"/>
+                <w:szCs w:val="24"/>
+                <w:lang w:val="en-AU"/>
+              </w:rPr>
+              <w:t xml:space="preserve"> curve conversion; 7-output layout; envelope area=0 bug; GH/Rhino context bug; pre-Demo fixes (response normalization, </w:t>
+            </w:r>
+            <w:proofErr w:type="spellStart"/>
+            <w:r>
+              <w:rPr>
+                <w:sz w:val="24"/>
+                <w:szCs w:val="24"/>
+                <w:lang w:val="en-AU"/>
+              </w:rPr>
+              <w:t>lat</w:t>
+            </w:r>
+            <w:proofErr w:type="spellEnd"/>
+            <w:r>
+              <w:rPr>
+                <w:sz w:val="24"/>
+                <w:szCs w:val="24"/>
+                <w:lang w:val="en-AU"/>
+              </w:rPr>
+              <w:t>/</w:t>
+            </w:r>
+            <w:proofErr w:type="spellStart"/>
+            <w:r>
+              <w:rPr>
+                <w:sz w:val="24"/>
+                <w:szCs w:val="24"/>
+                <w:lang w:val="en-AU"/>
+              </w:rPr>
+              <w:t>lon</w:t>
+            </w:r>
+            <w:proofErr w:type="spellEnd"/>
+            <w:r>
+              <w:rPr>
+                <w:sz w:val="24"/>
+                <w:szCs w:val="24"/>
+                <w:lang w:val="en-AU"/>
+              </w:rPr>
+              <w:t xml:space="preserve"> handling)</w:t>
             </w:r>
           </w:p>
         </w:tc>
@@ -4570,7 +4916,25 @@
           <w:szCs w:val="24"/>
           <w:lang w:val="en-AU"/>
         </w:rPr>
-        <w:t>Week 1 moved from infrastructure setup through production deployment in 14 days. The first half (Days 1–5) focused on the extraction pipeline: designing rule schema, parsing 191 DCP chunks, and achieving 94% F1 accuracy on extracted rules. By Day 4, the FastAPI backend was serving compliance requests across three test addresses with 100% ground-truth accuracy.</w:t>
+        <w:t xml:space="preserve">Week 1 moved from infrastructure setup through production deployment in 14 days. The first half (Days 1–5) focused on the extraction pipeline: designing rule schema, parsing 191 DCP chunks, and achieving 94% F1 accuracy on extracted rules. By Day 4, the </w:t>
+      </w:r>
+      <w:proofErr w:type="spellStart"/>
+      <w:r>
+        <w:rPr>
+          <w:sz w:val="24"/>
+          <w:szCs w:val="24"/>
+          <w:lang w:val="en-AU"/>
+        </w:rPr>
+        <w:t>FastAPI</w:t>
+      </w:r>
+      <w:proofErr w:type="spellEnd"/>
+      <w:r>
+        <w:rPr>
+          <w:sz w:val="24"/>
+          <w:szCs w:val="24"/>
+          <w:lang w:val="en-AU"/>
+        </w:rPr>
+        <w:t xml:space="preserve"> backend was serving compliance requests across three test addresses with 100% ground-truth accuracy.</w:t>
       </w:r>
     </w:p>
     <w:p>
@@ -4606,7 +4970,25 @@
           <w:szCs w:val="24"/>
           <w:lang w:val="en-AU"/>
         </w:rPr>
-        <w:t>Grasshopper plugin development ran in parallel, completing the 7-output visualization layer and GeoJSON-to-Rhino conversion. Two significant bugs emerged (envelope area returning zero, GH/Rhino document-context switching) and remained through the week, addressed only in pre-Demo fixes on Day 14.</w:t>
+        <w:t xml:space="preserve">Grasshopper plugin development ran in parallel, completing the 7-output visualization layer and </w:t>
+      </w:r>
+      <w:proofErr w:type="spellStart"/>
+      <w:r>
+        <w:rPr>
+          <w:sz w:val="24"/>
+          <w:szCs w:val="24"/>
+          <w:lang w:val="en-AU"/>
+        </w:rPr>
+        <w:t>GeoJSON</w:t>
+      </w:r>
+      <w:proofErr w:type="spellEnd"/>
+      <w:r>
+        <w:rPr>
+          <w:sz w:val="24"/>
+          <w:szCs w:val="24"/>
+          <w:lang w:val="en-AU"/>
+        </w:rPr>
+        <w:t>-to-Rhino conversion. Two significant bugs emerged (envelope area returning zero, GH/Rhino document-context switching) and remained through the week, addressed only in pre-Demo fixes on Day 14.</w:t>
       </w:r>
     </w:p>
     <w:p>
@@ -4806,6 +5188,7 @@
                 <w:sz w:val="24"/>
                 <w:szCs w:val="24"/>
               </w:rPr>
+              <w:lastRenderedPageBreak/>
               <w:t>Day</w:t>
             </w:r>
           </w:p>
@@ -4858,7 +5241,6 @@
                 <w:sz w:val="24"/>
                 <w:szCs w:val="24"/>
               </w:rPr>
-              <w:lastRenderedPageBreak/>
               <w:t>5 July</w:t>
             </w:r>
           </w:p>
@@ -4881,7 +5263,23 @@
                 <w:sz w:val="24"/>
                 <w:szCs w:val="24"/>
               </w:rPr>
-              <w:t xml:space="preserve">Removed Inner West/Marrickville/Ashfield extraction code and data; consolidated per-council extractors to single generic </w:t>
+              <w:t>Removed Inner West/</w:t>
+            </w:r>
+            <w:proofErr w:type="spellStart"/>
+            <w:r>
+              <w:rPr>
+                <w:sz w:val="24"/>
+                <w:szCs w:val="24"/>
+              </w:rPr>
+              <w:t>Marrickville</w:t>
+            </w:r>
+            <w:proofErr w:type="spellEnd"/>
+            <w:r>
+              <w:rPr>
+                <w:sz w:val="24"/>
+                <w:szCs w:val="24"/>
+              </w:rPr>
+              <w:t xml:space="preserve">/Ashfield extraction code and data; consolidated per-council extractors to single generic </w:t>
             </w:r>
             <w:r>
               <w:rPr>
@@ -4950,7 +5348,23 @@
                 <w:sz w:val="24"/>
                 <w:szCs w:val="24"/>
               </w:rPr>
-              <w:t>R1 CDC zone filter fix (initial implementation); discovered undocumented behaviour requiring author confirmation</w:t>
+              <w:t xml:space="preserve">R1 CDC zone filter fix (initial implementation); discovered undocumented </w:t>
+            </w:r>
+            <w:proofErr w:type="spellStart"/>
+            <w:r>
+              <w:rPr>
+                <w:sz w:val="24"/>
+                <w:szCs w:val="24"/>
+              </w:rPr>
+              <w:t>behaviour</w:t>
+            </w:r>
+            <w:proofErr w:type="spellEnd"/>
+            <w:r>
+              <w:rPr>
+                <w:sz w:val="24"/>
+                <w:szCs w:val="24"/>
+              </w:rPr>
+              <w:t xml:space="preserve"> requiring author confirmation</w:t>
             </w:r>
           </w:p>
         </w:tc>
@@ -5129,7 +5543,15 @@
         <w:t>and</w:t>
       </w:r>
       <w:r>
-        <w:t xml:space="preserve"> corrected where the original description didn't match what was actually shipped.</w:t>
+        <w:t xml:space="preserve"> corrected where the original description didn't match what was </w:t>
+      </w:r>
+      <w:proofErr w:type="gramStart"/>
+      <w:r>
+        <w:t>actually shipped</w:t>
+      </w:r>
+      <w:proofErr w:type="gramEnd"/>
+      <w:r>
+        <w:t>.</w:t>
       </w:r>
     </w:p>
     <w:p>
@@ -5166,6 +5588,7 @@
         </w:rPr>
         <w:t xml:space="preserve">Root cause: </w:t>
       </w:r>
+      <w:proofErr w:type="spellStart"/>
       <w:r>
         <w:rPr>
           <w:rFonts w:ascii="Consolas" w:hAnsi="Consolas"/>
@@ -5173,6 +5596,7 @@
         </w:rPr>
         <w:t>development_controls</w:t>
       </w:r>
+      <w:proofErr w:type="spellEnd"/>
       <w:r>
         <w:t xml:space="preserve"> wasn't returned from </w:t>
       </w:r>
@@ -5186,12 +5610,21 @@
       <w:r>
         <w:t xml:space="preserve">; Grasshopper was trying to recompute area from the converted Rhino surface, and </w:t>
       </w:r>
+      <w:proofErr w:type="spellStart"/>
       <w:r>
         <w:rPr>
           <w:rFonts w:ascii="Consolas" w:hAnsi="Consolas"/>
           <w:sz w:val="20"/>
         </w:rPr>
-        <w:t>AreaMassProperties.Compute()</w:t>
+        <w:t>AreaMassProperties.Compute</w:t>
+      </w:r>
+      <w:proofErr w:type="spellEnd"/>
+      <w:r>
+        <w:rPr>
+          <w:rFonts w:ascii="Consolas" w:hAnsi="Consolas"/>
+          <w:sz w:val="20"/>
+        </w:rPr>
+        <w:t>()</w:t>
       </w:r>
       <w:r>
         <w:t xml:space="preserve"> returned 0 for that surface.</w:t>
@@ -5210,6 +5643,7 @@
       <w:r>
         <w:t xml:space="preserve">Return </w:t>
       </w:r>
+      <w:proofErr w:type="spellStart"/>
       <w:r>
         <w:rPr>
           <w:rFonts w:ascii="Consolas" w:hAnsi="Consolas"/>
@@ -5217,6 +5651,7 @@
         </w:rPr>
         <w:t>development_controls</w:t>
       </w:r>
+      <w:proofErr w:type="spellEnd"/>
       <w:r>
         <w:t xml:space="preserve"> from the API; make Grasshopper consume the backend's area directly instead of recalculating.</w:t>
       </w:r>
@@ -5287,7 +5722,39 @@
           <w:rFonts w:ascii="Consolas" w:hAnsi="Consolas"/>
           <w:sz w:val="20"/>
         </w:rPr>
-        <w:t>_apply_directional_setbacks()</w:t>
+        <w:t>_</w:t>
+      </w:r>
+      <w:proofErr w:type="spellStart"/>
+      <w:r>
+        <w:rPr>
+          <w:rFonts w:ascii="Consolas" w:hAnsi="Consolas"/>
+          <w:sz w:val="20"/>
+        </w:rPr>
+        <w:t>apply_directional_</w:t>
+      </w:r>
+      <w:proofErr w:type="gramStart"/>
+      <w:r>
+        <w:rPr>
+          <w:rFonts w:ascii="Consolas" w:hAnsi="Consolas"/>
+          <w:sz w:val="20"/>
+        </w:rPr>
+        <w:t>setbacks</w:t>
+      </w:r>
+      <w:proofErr w:type="spellEnd"/>
+      <w:r>
+        <w:rPr>
+          <w:rFonts w:ascii="Consolas" w:hAnsi="Consolas"/>
+          <w:sz w:val="20"/>
+        </w:rPr>
+        <w:t>(</w:t>
+      </w:r>
+      <w:proofErr w:type="gramEnd"/>
+      <w:r>
+        <w:rPr>
+          <w:rFonts w:ascii="Consolas" w:hAnsi="Consolas"/>
+          <w:sz w:val="20"/>
+        </w:rPr>
+        <w:t>)</w:t>
       </w:r>
       <w:r>
         <w:t>:</w:t>
@@ -5381,7 +5848,23 @@
           <w:sz w:val="24"/>
           <w:szCs w:val="24"/>
         </w:rPr>
-        <w:t xml:space="preserve"> correction was already applied when converting the setback offset vector from metres to degrees, to account for longitude degrees being physically shorter than latitude degrees away from the equator.</w:t>
+        <w:t xml:space="preserve"> correction was already applied when converting the setback offset vector from </w:t>
+      </w:r>
+      <w:proofErr w:type="spellStart"/>
+      <w:r>
+        <w:rPr>
+          <w:sz w:val="24"/>
+          <w:szCs w:val="24"/>
+        </w:rPr>
+        <w:t>metres</w:t>
+      </w:r>
+      <w:proofErr w:type="spellEnd"/>
+      <w:r>
+        <w:rPr>
+          <w:sz w:val="24"/>
+          <w:szCs w:val="24"/>
+        </w:rPr>
+        <w:t xml:space="preserve"> to degrees, to account for longitude degrees being physically shorter than latitude degrees away from the equator.</w:t>
       </w:r>
     </w:p>
     <w:p>
@@ -5398,7 +5881,25 @@
           <w:sz w:val="24"/>
           <w:szCs w:val="24"/>
         </w:rPr>
-        <w:t xml:space="preserve">What the shipped code actually did: </w:t>
+        <w:t xml:space="preserve">What the shipped code </w:t>
+      </w:r>
+      <w:proofErr w:type="gramStart"/>
+      <w:r>
+        <w:rPr>
+          <w:b/>
+          <w:sz w:val="24"/>
+          <w:szCs w:val="24"/>
+        </w:rPr>
+        <w:t>actually did</w:t>
+      </w:r>
+      <w:proofErr w:type="gramEnd"/>
+      <w:r>
+        <w:rPr>
+          <w:b/>
+          <w:sz w:val="24"/>
+          <w:szCs w:val="24"/>
+        </w:rPr>
+        <w:t xml:space="preserve">: </w:t>
       </w:r>
       <w:r>
         <w:rPr>
@@ -5443,7 +5944,15 @@
           <w:sz w:val="24"/>
           <w:szCs w:val="24"/>
         </w:rPr>
-        <w:t xml:space="preserve"> term existed anywhere in the setback-clipping path. At Sydney's latitude (≈ -33.85°, cos ≈ 0.83), this silently under-applied setbacks by up to ~17% on east/west-facing lot edges </w:t>
+        <w:t xml:space="preserve"> term existed anywhere in the setback-clipping path. At Sydney's latitude (≈ -33.85°, cos ≈ 0.83), this silently under-applied setbacks by up to ~17% on east/west-facing lot </w:t>
+      </w:r>
+      <w:proofErr w:type="gramStart"/>
+      <w:r>
+        <w:rPr>
+          <w:sz w:val="24"/>
+          <w:szCs w:val="24"/>
+        </w:rPr>
+        <w:t xml:space="preserve">edges </w:t>
       </w:r>
       <w:r>
         <w:rPr>
@@ -5452,6 +5961,7 @@
         </w:rPr>
         <w:t>,</w:t>
       </w:r>
+      <w:proofErr w:type="gramEnd"/>
       <w:r>
         <w:rPr>
           <w:sz w:val="24"/>
@@ -5474,14 +5984,40 @@
           <w:sz w:val="24"/>
           <w:szCs w:val="24"/>
         </w:rPr>
-        <w:t xml:space="preserve">The fix : </w:t>
-      </w:r>
-      <w:r>
-        <w:rPr>
-          <w:sz w:val="24"/>
-          <w:szCs w:val="24"/>
-        </w:rPr>
-        <w:t>rewrote the setback-application path to project the lot polygon into a local metric coordinate system (</w:t>
+        <w:t xml:space="preserve">The </w:t>
+      </w:r>
+      <w:proofErr w:type="gramStart"/>
+      <w:r>
+        <w:rPr>
+          <w:b/>
+          <w:sz w:val="24"/>
+          <w:szCs w:val="24"/>
+        </w:rPr>
+        <w:t>fix :</w:t>
+      </w:r>
+      <w:proofErr w:type="gramEnd"/>
+      <w:r>
+        <w:rPr>
+          <w:b/>
+          <w:sz w:val="24"/>
+          <w:szCs w:val="24"/>
+        </w:rPr>
+        <w:t xml:space="preserve"> </w:t>
+      </w:r>
+      <w:r>
+        <w:rPr>
+          <w:sz w:val="24"/>
+          <w:szCs w:val="24"/>
+        </w:rPr>
+        <w:t xml:space="preserve">rewrote the setback-application path to project the lot polygon into a local metric coordinate </w:t>
+      </w:r>
+      <w:proofErr w:type="gramStart"/>
+      <w:r>
+        <w:rPr>
+          <w:sz w:val="24"/>
+          <w:szCs w:val="24"/>
+        </w:rPr>
+        <w:t>system (</w:t>
       </w:r>
       <w:r>
         <w:rPr>
@@ -5489,8 +6025,19 @@
           <w:sz w:val="24"/>
           <w:szCs w:val="24"/>
         </w:rPr>
-        <w:t>_project_to_m</w:t>
-      </w:r>
+        <w:t>_</w:t>
+      </w:r>
+      <w:proofErr w:type="spellStart"/>
+      <w:proofErr w:type="gramEnd"/>
+      <w:r>
+        <w:rPr>
+          <w:rFonts w:ascii="Consolas" w:hAnsi="Consolas"/>
+          <w:sz w:val="24"/>
+          <w:szCs w:val="24"/>
+        </w:rPr>
+        <w:t>project_to_m</w:t>
+      </w:r>
+      <w:proofErr w:type="spellEnd"/>
       <w:r>
         <w:rPr>
           <w:sz w:val="24"/>
@@ -5534,8 +6081,41 @@
           <w:szCs w:val="24"/>
         </w:rPr>
         <w:lastRenderedPageBreak/>
-        <w:t xml:space="preserve">computed area from raw lon/lat degrees: </w:t>
-      </w:r>
+        <w:t xml:space="preserve">computed area from raw </w:t>
+      </w:r>
+      <w:proofErr w:type="spellStart"/>
+      <w:r>
+        <w:rPr>
+          <w:sz w:val="24"/>
+          <w:szCs w:val="24"/>
+        </w:rPr>
+        <w:t>lon</w:t>
+      </w:r>
+      <w:proofErr w:type="spellEnd"/>
+      <w:r>
+        <w:rPr>
+          <w:sz w:val="24"/>
+          <w:szCs w:val="24"/>
+        </w:rPr>
+        <w:t>/</w:t>
+      </w:r>
+      <w:proofErr w:type="spellStart"/>
+      <w:r>
+        <w:rPr>
+          <w:sz w:val="24"/>
+          <w:szCs w:val="24"/>
+        </w:rPr>
+        <w:t>lat</w:t>
+      </w:r>
+      <w:proofErr w:type="spellEnd"/>
+      <w:r>
+        <w:rPr>
+          <w:sz w:val="24"/>
+          <w:szCs w:val="24"/>
+        </w:rPr>
+        <w:t xml:space="preserve"> degrees: </w:t>
+      </w:r>
+      <w:proofErr w:type="spellStart"/>
       <w:r>
         <w:rPr>
           <w:rFonts w:ascii="Consolas" w:hAnsi="Consolas"/>
@@ -5549,7 +6129,15 @@
           <w:sz w:val="24"/>
           <w:szCs w:val="24"/>
         </w:rPr>
-        <w:t xml:space="preserve">'s </w:t>
+        <w:t>'s</w:t>
+      </w:r>
+      <w:proofErr w:type="spellEnd"/>
+      <w:r>
+        <w:rPr>
+          <w:sz w:val="24"/>
+          <w:szCs w:val="24"/>
+        </w:rPr>
+        <w:t xml:space="preserve"> </w:t>
       </w:r>
       <w:r>
         <w:rPr>
@@ -5557,7 +6145,43 @@
           <w:sz w:val="24"/>
           <w:szCs w:val="24"/>
         </w:rPr>
-        <w:t>_area_sqm()</w:t>
+        <w:t>_</w:t>
+      </w:r>
+      <w:proofErr w:type="spellStart"/>
+      <w:r>
+        <w:rPr>
+          <w:rFonts w:ascii="Consolas" w:hAnsi="Consolas"/>
+          <w:sz w:val="24"/>
+          <w:szCs w:val="24"/>
+        </w:rPr>
+        <w:t>area_</w:t>
+      </w:r>
+      <w:proofErr w:type="gramStart"/>
+      <w:r>
+        <w:rPr>
+          <w:rFonts w:ascii="Consolas" w:hAnsi="Consolas"/>
+          <w:sz w:val="24"/>
+          <w:szCs w:val="24"/>
+        </w:rPr>
+        <w:t>sqm</w:t>
+      </w:r>
+      <w:proofErr w:type="spellEnd"/>
+      <w:r>
+        <w:rPr>
+          <w:rFonts w:ascii="Consolas" w:hAnsi="Consolas"/>
+          <w:sz w:val="24"/>
+          <w:szCs w:val="24"/>
+        </w:rPr>
+        <w:t>(</w:t>
+      </w:r>
+      <w:proofErr w:type="gramEnd"/>
+      <w:r>
+        <w:rPr>
+          <w:rFonts w:ascii="Consolas" w:hAnsi="Consolas"/>
+          <w:sz w:val="24"/>
+          <w:szCs w:val="24"/>
+        </w:rPr>
+        <w:t>)</w:t>
       </w:r>
       <w:r>
         <w:rPr>
@@ -5566,6 +6190,7 @@
         </w:rPr>
         <w:t xml:space="preserve">, </w:t>
       </w:r>
+      <w:proofErr w:type="spellStart"/>
       <w:r>
         <w:rPr>
           <w:rFonts w:ascii="Consolas" w:hAnsi="Consolas"/>
@@ -5579,8 +6204,17 @@
           <w:sz w:val="24"/>
           <w:szCs w:val="24"/>
         </w:rPr>
-        <w:t xml:space="preserve">'s CDC lot-area calculation, and </w:t>
-      </w:r>
+        <w:t>'s</w:t>
+      </w:r>
+      <w:proofErr w:type="spellEnd"/>
+      <w:r>
+        <w:rPr>
+          <w:sz w:val="24"/>
+          <w:szCs w:val="24"/>
+        </w:rPr>
+        <w:t xml:space="preserve"> CDC lot-area calculation, and </w:t>
+      </w:r>
+      <w:proofErr w:type="spellStart"/>
       <w:r>
         <w:rPr>
           <w:rFonts w:ascii="Consolas" w:hAnsi="Consolas"/>
@@ -5594,15 +6228,51 @@
           <w:sz w:val="24"/>
           <w:szCs w:val="24"/>
         </w:rPr>
-        <w:t xml:space="preserve">'s </w:t>
-      </w:r>
+        <w:t>'s</w:t>
+      </w:r>
+      <w:proofErr w:type="spellEnd"/>
+      <w:r>
+        <w:rPr>
+          <w:sz w:val="24"/>
+          <w:szCs w:val="24"/>
+        </w:rPr>
+        <w:t xml:space="preserve"> </w:t>
+      </w:r>
+      <w:proofErr w:type="spellStart"/>
       <w:r>
         <w:rPr>
           <w:rFonts w:ascii="Consolas" w:hAnsi="Consolas"/>
           <w:sz w:val="24"/>
           <w:szCs w:val="24"/>
         </w:rPr>
-        <w:t>compute_lot_dimensions()</w:t>
+        <w:t>compute_lot_</w:t>
+      </w:r>
+      <w:proofErr w:type="gramStart"/>
+      <w:r>
+        <w:rPr>
+          <w:rFonts w:ascii="Consolas" w:hAnsi="Consolas"/>
+          <w:sz w:val="24"/>
+          <w:szCs w:val="24"/>
+        </w:rPr>
+        <w:t>dimensions</w:t>
+      </w:r>
+      <w:proofErr w:type="spellEnd"/>
+      <w:r>
+        <w:rPr>
+          <w:rFonts w:ascii="Consolas" w:hAnsi="Consolas"/>
+          <w:sz w:val="24"/>
+          <w:szCs w:val="24"/>
+        </w:rPr>
+        <w:t>(</w:t>
+      </w:r>
+      <w:proofErr w:type="gramEnd"/>
+      <w:r>
+        <w:rPr>
+          <w:rFonts w:ascii="Consolas" w:hAnsi="Consolas"/>
+          <w:sz w:val="24"/>
+          <w:szCs w:val="24"/>
+        </w:rPr>
+        <w:t>)</w:t>
       </w:r>
       <w:r>
         <w:rPr>
@@ -5648,7 +6318,23 @@
           <w:sz w:val="24"/>
           <w:szCs w:val="24"/>
         </w:rPr>
-        <w:t xml:space="preserve"> constant (used to build an oversized half-plane rectangle for clipping) was tuned for degree-space, where a lot spans ~0.0003°. Once coordinates were correctly projected to metres, that same constant became a comically small 2 </w:t>
+        <w:t xml:space="preserve"> constant (used to build an oversized half-plane rectangle for clipping) was tuned for degree-space, where a lot spans ~0.0003°. Once coordinates were correctly projected to </w:t>
+      </w:r>
+      <w:proofErr w:type="spellStart"/>
+      <w:r>
+        <w:rPr>
+          <w:sz w:val="24"/>
+          <w:szCs w:val="24"/>
+        </w:rPr>
+        <w:t>metres</w:t>
+      </w:r>
+      <w:proofErr w:type="spellEnd"/>
+      <w:r>
+        <w:rPr>
+          <w:sz w:val="24"/>
+          <w:szCs w:val="24"/>
+        </w:rPr>
+        <w:t xml:space="preserve">, that same constant became a comically small 2 </w:t>
       </w:r>
       <w:r>
         <w:rPr>
@@ -5786,12 +6472,21 @@
         </w:rPr>
         <w:t xml:space="preserve"> </w:t>
       </w:r>
-      <w:r>
-        <w:rPr>
-          <w:sz w:val="24"/>
-          <w:szCs w:val="24"/>
-        </w:rPr>
-        <w:t>standardised units (900mm vs 0.9m), and ambiguous parameter names.</w:t>
+      <w:proofErr w:type="spellStart"/>
+      <w:r>
+        <w:rPr>
+          <w:sz w:val="24"/>
+          <w:szCs w:val="24"/>
+        </w:rPr>
+        <w:t>standardised</w:t>
+      </w:r>
+      <w:proofErr w:type="spellEnd"/>
+      <w:r>
+        <w:rPr>
+          <w:sz w:val="24"/>
+          <w:szCs w:val="24"/>
+        </w:rPr>
+        <w:t xml:space="preserve"> units (900mm vs 0.9m), and ambiguous parameter names.</w:t>
       </w:r>
     </w:p>
     <w:p>
@@ -5868,7 +6563,23 @@
           <w:sz w:val="24"/>
           <w:szCs w:val="24"/>
         </w:rPr>
-        <w:t xml:space="preserve"> extracts using Gemini and Groq only — the Anthropic client and </w:t>
+        <w:t xml:space="preserve"> extracts using Gemini and </w:t>
+      </w:r>
+      <w:proofErr w:type="spellStart"/>
+      <w:r>
+        <w:rPr>
+          <w:sz w:val="24"/>
+          <w:szCs w:val="24"/>
+        </w:rPr>
+        <w:t>Groq</w:t>
+      </w:r>
+      <w:proofErr w:type="spellEnd"/>
+      <w:r>
+        <w:rPr>
+          <w:sz w:val="24"/>
+          <w:szCs w:val="24"/>
+        </w:rPr>
+        <w:t xml:space="preserve"> only — the Anthropic client and </w:t>
       </w:r>
       <w:r>
         <w:rPr>
@@ -5928,7 +6639,23 @@
           <w:sz w:val="24"/>
           <w:szCs w:val="24"/>
         </w:rPr>
-        <w:t xml:space="preserve"> in this engagement). If Claude-based extraction is a claimed differentiator going forward, it needs to actually be reinstated — it isn't running today.</w:t>
+        <w:t xml:space="preserve"> in this engagement). If Claude-based extraction is a claimed differentiator going forward, it needs to </w:t>
+      </w:r>
+      <w:proofErr w:type="gramStart"/>
+      <w:r>
+        <w:rPr>
+          <w:sz w:val="24"/>
+          <w:szCs w:val="24"/>
+        </w:rPr>
+        <w:t>actually be</w:t>
+      </w:r>
+      <w:proofErr w:type="gramEnd"/>
+      <w:r>
+        <w:rPr>
+          <w:sz w:val="24"/>
+          <w:szCs w:val="24"/>
+        </w:rPr>
+        <w:t xml:space="preserve"> reinstated — it isn't running today.</w:t>
       </w:r>
     </w:p>
     <w:p>
@@ -5947,6 +6674,7 @@
         </w:rPr>
         <w:t xml:space="preserve">A second, separate gap found in this engagement: </w:t>
       </w:r>
+      <w:proofErr w:type="spellStart"/>
       <w:r>
         <w:rPr>
           <w:rFonts w:ascii="Consolas" w:hAnsi="Consolas"/>
@@ -5960,15 +6688,33 @@
           <w:sz w:val="24"/>
           <w:szCs w:val="24"/>
         </w:rPr>
-        <w:t xml:space="preserve">'s own </w:t>
-      </w:r>
+        <w:t>'s</w:t>
+      </w:r>
+      <w:proofErr w:type="spellEnd"/>
+      <w:r>
+        <w:rPr>
+          <w:sz w:val="24"/>
+          <w:szCs w:val="24"/>
+        </w:rPr>
+        <w:t xml:space="preserve"> own </w:t>
+      </w:r>
+      <w:proofErr w:type="gramStart"/>
       <w:r>
         <w:rPr>
           <w:rFonts w:ascii="Consolas" w:hAnsi="Consolas"/>
           <w:sz w:val="24"/>
           <w:szCs w:val="24"/>
         </w:rPr>
-        <w:t>validate()</w:t>
+        <w:t>validate(</w:t>
+      </w:r>
+      <w:proofErr w:type="gramEnd"/>
+      <w:r>
+        <w:rPr>
+          <w:rFonts w:ascii="Consolas" w:hAnsi="Consolas"/>
+          <w:sz w:val="24"/>
+          <w:szCs w:val="24"/>
+        </w:rPr>
+        <w:t>)</w:t>
       </w:r>
       <w:r>
         <w:rPr>
@@ -5977,6 +6723,7 @@
         </w:rPr>
         <w:t xml:space="preserve"> correctly flags schema-invalid rules, but flagged rules are still written into the same output file as valid ones, and nothing downstream checks the </w:t>
       </w:r>
+      <w:proofErr w:type="spellStart"/>
       <w:r>
         <w:rPr>
           <w:rFonts w:ascii="Consolas" w:hAnsi="Consolas"/>
@@ -5985,6 +6732,7 @@
         </w:rPr>
         <w:t>validation_warnings</w:t>
       </w:r>
+      <w:proofErr w:type="spellEnd"/>
       <w:r>
         <w:rPr>
           <w:sz w:val="24"/>
@@ -6030,7 +6778,15 @@
         <w:t xml:space="preserve">Problem: </w:t>
       </w:r>
       <w:r>
-        <w:t xml:space="preserve">a colour-assignment script failed inside the Grasshopper Python component with “this type of object is not supported in Grasshopper” it was trying to create Rhino layers while </w:t>
+        <w:t xml:space="preserve">a </w:t>
+      </w:r>
+      <w:proofErr w:type="spellStart"/>
+      <w:r>
+        <w:t>colour</w:t>
+      </w:r>
+      <w:proofErr w:type="spellEnd"/>
+      <w:r>
+        <w:t xml:space="preserve">-assignment script failed inside the Grasshopper Python component with “this type of object is not supported in Grasshopper” it was trying to create Rhino layers while </w:t>
       </w:r>
       <w:r>
         <w:rPr>
@@ -6066,6 +6822,8 @@
       <w:r>
         <w:t xml:space="preserve">, switch it to </w:t>
       </w:r>
+      <w:proofErr w:type="spellStart"/>
+      <w:proofErr w:type="gramStart"/>
       <w:r>
         <w:rPr>
           <w:rFonts w:ascii="Consolas" w:hAnsi="Consolas"/>
@@ -6073,6 +6831,8 @@
         </w:rPr>
         <w:t>Rhino.RhinoDoc.ActiveDoc</w:t>
       </w:r>
+      <w:proofErr w:type="spellEnd"/>
+      <w:proofErr w:type="gramEnd"/>
       <w:r>
         <w:t xml:space="preserve"> for the duration of the layer operations, then restore it.</w:t>
       </w:r>
@@ -6093,11 +6853,211 @@
     </w:p>
     <w:p>
       <w:pPr>
+        <w:spacing w:after="0" w:line="240" w:lineRule="auto"/>
+      </w:pPr>
+    </w:p>
+    <w:p>
+      <w:pPr>
         <w:pStyle w:val="Heading2"/>
       </w:pPr>
+      <w:r>
+        <w:t>6.</w:t>
+      </w:r>
+      <w:r>
+        <w:t>6</w:t>
+      </w:r>
+      <w:r>
+        <w:t xml:space="preserve"> Grasshopper/Rhino </w:t>
+      </w:r>
+      <w:r>
+        <w:t xml:space="preserve">Application Familiarity </w:t>
+      </w:r>
+      <w:r>
+        <w:t>(Period 1)</w:t>
+      </w:r>
+    </w:p>
+    <w:p>
+      <w:pPr>
+        <w:spacing w:after="0" w:line="240" w:lineRule="auto"/>
+      </w:pPr>
+      <w:r>
+        <w:rPr>
+          <w:b/>
+          <w:bCs/>
+        </w:rPr>
+        <w:t>Problem:</w:t>
+      </w:r>
+      <w:r>
+        <w:t xml:space="preserve"> Neither team member had used Rhino or Grasshopper before this project, and unlike the domain gap described in </w:t>
+      </w:r>
+      <w:r>
+        <w:t>(</w:t>
+      </w:r>
+      <w:r>
+        <w:t>5</w:t>
+      </w:r>
+      <w:r>
+        <w:t>)</w:t>
+      </w:r>
+      <w:r>
+        <w:t xml:space="preserve">, which at least had two co-founders bridging software and </w:t>
+      </w:r>
+      <w:r>
+        <w:t>architecture there</w:t>
+      </w:r>
+      <w:r>
+        <w:t xml:space="preserve"> was no one on the team, or available to consult, with prior Rhino/Grasshopper experience. Basic mechanics (the Grasshopper canvas, component wiring, how a Python component executes within a GH definition, the GH/Rhino document-context split later diagnosed in §6.5) all had to be learned from documentation and trial-and-error, with no shortcut from someone who'd hit these issues before.</w:t>
+      </w:r>
+    </w:p>
+    <w:p>
+      <w:pPr>
+        <w:spacing w:after="0" w:line="240" w:lineRule="auto"/>
+      </w:pPr>
+      <w:r>
+        <w:rPr>
+          <w:b/>
+          <w:bCs/>
+        </w:rPr>
+        <w:t>Fix:</w:t>
+      </w:r>
+      <w:r>
+        <w:t xml:space="preserve"> No shortcut existed, so the team treated it as a dedicated phase rather than trying to learn the tool and build the plugin simultaneously</w:t>
+      </w:r>
+      <w:r>
+        <w:t>,</w:t>
+      </w:r>
+      <w:r>
+        <w:t xml:space="preserve"> roughly 3</w:t>
+      </w:r>
+      <w:r>
+        <w:t>-</w:t>
+      </w:r>
+      <w:r>
+        <w:t xml:space="preserve">4 days were spent purely on </w:t>
+      </w:r>
+      <w:r>
+        <w:t>familiarization</w:t>
+      </w:r>
+      <w:r>
+        <w:t xml:space="preserve"> (working through sample definitions, understanding the component model) before writing any project-specific plugin logic.</w:t>
+      </w:r>
+    </w:p>
+    <w:p>
+      <w:pPr>
+        <w:spacing w:after="0" w:line="240" w:lineRule="auto"/>
+      </w:pPr>
+      <w:r>
+        <w:rPr>
+          <w:b/>
+          <w:bCs/>
+        </w:rPr>
+        <w:t>Lesson:</w:t>
+      </w:r>
+      <w:r>
+        <w:t xml:space="preserve"> For a tool that is the product's "founding bet" (3) rather than incidental infrastructure, ramp-up time on unfamiliar software should be budgeted explicitly, not folded into build time. It also compounds with the domain-expertise gap (5, 11.5): the team was simultaneously learning an unfamiliar application and the architectural domain it operates in</w:t>
+      </w:r>
+      <w:r>
+        <w:t>.</w:t>
+      </w:r>
+    </w:p>
+    <w:p>
+      <w:pPr>
+        <w:spacing w:after="0" w:line="240" w:lineRule="auto"/>
+      </w:pPr>
+    </w:p>
+    <w:p>
+      <w:pPr>
+        <w:pStyle w:val="Heading2"/>
+      </w:pPr>
+      <w:r>
+        <w:t>6.</w:t>
+      </w:r>
+      <w:r>
+        <w:t>7</w:t>
+      </w:r>
+      <w:r>
+        <w:t xml:space="preserve"> Grasshopper/Rhino </w:t>
+      </w:r>
+      <w:r>
+        <w:t xml:space="preserve">Application Expiration (Period 2) </w:t>
+      </w:r>
+    </w:p>
+    <w:p>
+      <w:pPr>
+        <w:spacing w:after="0" w:line="240" w:lineRule="auto"/>
+      </w:pPr>
+      <w:r>
+        <w:rPr>
+          <w:b/>
+          <w:bCs/>
+        </w:rPr>
+        <w:t>Problem:</w:t>
+      </w:r>
+      <w:r>
+        <w:t xml:space="preserve"> Rhino's free trial license — the only way the team could run and test the Grasshopper plugin, since a paid seat was out of scope/budget for this project — expired roughly 90 days after initial installation, partway through Period 2. This blocked all plugin-side verification until resolved, and the same constraint resurfaced during this engagement: the trial had expired again by the time of this report, meaning the geometry fixes in §6.3 could be verified against the backend and browser map, but not re-confirmed inside Rhino/Grasshopper itself.</w:t>
+      </w:r>
+    </w:p>
+    <w:p>
+      <w:pPr>
+        <w:spacing w:after="0" w:line="240" w:lineRule="auto"/>
+      </w:pPr>
+      <w:r>
+        <w:rPr>
+          <w:b/>
+          <w:bCs/>
+        </w:rPr>
+        <w:t>Fix:</w:t>
+      </w:r>
+      <w:r>
+        <w:t xml:space="preserve"> Rather than purchase a license, the team registered a new Rhino trial under a different email address to obtain a fresh 90-day evaluation window and resume plugin testing.</w:t>
+      </w:r>
+    </w:p>
+    <w:p>
+      <w:pPr>
+        <w:spacing w:after="0" w:line="240" w:lineRule="auto"/>
+      </w:pPr>
+      <w:r>
+        <w:rPr>
+          <w:b/>
+          <w:bCs/>
+        </w:rPr>
+        <w:t>Lesson:</w:t>
+      </w:r>
+      <w:r>
+        <w:t xml:space="preserve"> A free-trial window is a recurring constraint for this </w:t>
+      </w:r>
+      <w:r>
+        <w:t xml:space="preserve">project; </w:t>
+      </w:r>
+      <w:r>
+        <w:t xml:space="preserve">it will lapse again on roughly the same cycle. Two things follow: (1) plugin-affecting changes should get an explicit "verified in Rhino: yes/no, as of [date]" note rather than assumed-current status, since backend/browser verification alone (as in this engagement) cannot confirm Grasshopper-side </w:t>
+      </w:r>
+      <w:r>
+        <w:t>behavior</w:t>
+      </w:r>
+      <w:r>
+        <w:t>; and (2) if the plugin remains core to the product, budgeting a real license is a decision worth making deliberately rather than continuing the email-swap workaround indefinitely.</w:t>
+      </w:r>
+    </w:p>
+    <w:p>
+      <w:pPr>
+        <w:spacing w:after="0" w:line="240" w:lineRule="auto"/>
+      </w:pPr>
+    </w:p>
+    <w:p>
+      <w:pPr>
+        <w:pStyle w:val="Heading2"/>
+      </w:pPr>
       <w:bookmarkStart w:id="16" w:name="_Toc235115196"/>
       <w:r>
-        <w:t>6.6 NSW API Rate Limiting (Period 1)</w:t>
+        <w:lastRenderedPageBreak/>
+        <w:t>6.</w:t>
+      </w:r>
+      <w:r>
+        <w:t>8</w:t>
+      </w:r>
+      <w:r>
+        <w:t xml:space="preserve"> NSW API Rate Limiting (Period 1)</w:t>
       </w:r>
       <w:bookmarkEnd w:id="16"/>
     </w:p>
@@ -6133,8 +7093,17 @@
           <w:rFonts w:ascii="Consolas" w:hAnsi="Consolas"/>
           <w:sz w:val="20"/>
         </w:rPr>
-        <w:t>data/cached_lots.json</w:t>
-      </w:r>
+        <w:t>data/</w:t>
+      </w:r>
+      <w:proofErr w:type="spellStart"/>
+      <w:r>
+        <w:rPr>
+          <w:rFonts w:ascii="Consolas" w:hAnsi="Consolas"/>
+          <w:sz w:val="20"/>
+        </w:rPr>
+        <w:t>cached_lots.json</w:t>
+      </w:r>
+      <w:proofErr w:type="spellEnd"/>
       <w:r>
         <w:t>) storing the full resolved lot record per address. First request: 2-3s; cached: near-instant. Live map-layer data (FSR/height/lot-size/heritage) is re-fetched if the cached copy is older than 30 days, so a permanent cache doesn't serve stale post-amendment values forever.</w:t>
       </w:r>
@@ -6145,7 +7114,13 @@
       </w:pPr>
       <w:bookmarkStart w:id="17" w:name="_Toc235115197"/>
       <w:r>
-        <w:t>6.7 Multi-Council DCP Variation (Period 1)</w:t>
+        <w:t>6.</w:t>
+      </w:r>
+      <w:r>
+        <w:t>9</w:t>
+      </w:r>
+      <w:r>
+        <w:t xml:space="preserve"> Multi-Council DCP Variation (Period 1)</w:t>
       </w:r>
       <w:bookmarkEnd w:id="17"/>
     </w:p>
@@ -6160,7 +7135,15 @@
         <w:t xml:space="preserve">Problem: </w:t>
       </w:r>
       <w:r>
-        <w:t>Canada Bay's DCP structure differs from Inner West's three separate DCPs (Marrickville, Ashfield, briefly Leichhardt); parameter naming and section structure varied by council.</w:t>
+        <w:t>Canada Bay's DCP structure differs from Inner West's three separate DCPs (</w:t>
+      </w:r>
+      <w:proofErr w:type="spellStart"/>
+      <w:r>
+        <w:t>Marrickville</w:t>
+      </w:r>
+      <w:proofErr w:type="spellEnd"/>
+      <w:r>
+        <w:t>, Ashfield, briefly Leichhardt); parameter naming and section structure varied by council.</w:t>
       </w:r>
     </w:p>
     <w:p>
@@ -6208,7 +7191,15 @@
         <w:t xml:space="preserve">What actually happened next: </w:t>
       </w:r>
       <w:r>
-        <w:t xml:space="preserve">rather than generalising this further to more councils (per the original roadmap), the 5 July cleanup consolidated extraction into one generic </w:t>
+        <w:t xml:space="preserve">rather than </w:t>
+      </w:r>
+      <w:proofErr w:type="spellStart"/>
+      <w:r>
+        <w:t>generalising</w:t>
+      </w:r>
+      <w:proofErr w:type="spellEnd"/>
+      <w:r>
+        <w:t xml:space="preserve"> this further to more councils (per the original roadmap), the 5 July cleanup consolidated extraction into one generic </w:t>
       </w:r>
       <w:r>
         <w:rPr>
@@ -6218,18 +7209,42 @@
         <w:t>pipeline.py</w:t>
       </w:r>
       <w:r>
-        <w:t xml:space="preserve"> driven by a document-structure-detection step (works out a DCP's clause-labelling and heading conventions per document, rather than hardcoding them)  and</w:t>
-      </w:r>
-      <w:r>
-        <w:t xml:space="preserve"> simultaneously removed Inner West support entirely, narrowing live scope back to Canada Bay only. The generic pipeline exists and is designed to generalise; it just isn't currently pointed at any council but Canada Bay in </w:t>
-      </w:r>
+        <w:t xml:space="preserve"> driven by a document-structure-detection step (works out a DCP's clause-labelling and heading conventions per document, rather than hardcoding </w:t>
+      </w:r>
+      <w:proofErr w:type="gramStart"/>
+      <w:r>
+        <w:t>them)  and</w:t>
+      </w:r>
+      <w:proofErr w:type="gramEnd"/>
+      <w:r>
+        <w:t xml:space="preserve"> simultaneously removed Inner West support entirely, narrowing live scope back to Canada Bay only. The generic pipeline exists and is designed to </w:t>
+      </w:r>
+      <w:proofErr w:type="spellStart"/>
+      <w:r>
+        <w:t>generalise</w:t>
+      </w:r>
+      <w:proofErr w:type="spellEnd"/>
+      <w:r>
+        <w:t xml:space="preserve">; it just isn't currently pointed at any council but Canada Bay in </w:t>
+      </w:r>
+      <w:proofErr w:type="spellStart"/>
       <w:r>
         <w:rPr>
           <w:rFonts w:ascii="Consolas" w:hAnsi="Consolas"/>
           <w:sz w:val="20"/>
         </w:rPr>
-        <w:t>pipeline_manifest.json</w:t>
-      </w:r>
+        <w:t>pipeline_</w:t>
+      </w:r>
+      <w:proofErr w:type="gramStart"/>
+      <w:r>
+        <w:rPr>
+          <w:rFonts w:ascii="Consolas" w:hAnsi="Consolas"/>
+          <w:sz w:val="20"/>
+        </w:rPr>
+        <w:t>manifest.json</w:t>
+      </w:r>
+      <w:proofErr w:type="spellEnd"/>
+      <w:proofErr w:type="gramEnd"/>
       <w:r>
         <w:t>.</w:t>
       </w:r>
@@ -6240,7 +7255,13 @@
       </w:pPr>
       <w:bookmarkStart w:id="18" w:name="_Toc235115198"/>
       <w:r>
-        <w:t>6.8 Envelope Geometry Edge-Detection Weaknesses (Found in This Engagement, Still Open)</w:t>
+        <w:t>6.</w:t>
+      </w:r>
+      <w:r>
+        <w:t>10</w:t>
+      </w:r>
+      <w:r>
+        <w:t xml:space="preserve"> Envelope Geometry Edge-Detection Weaknesses (Found in This Engagement, Still Open)</w:t>
       </w:r>
       <w:bookmarkEnd w:id="18"/>
     </w:p>
@@ -6276,13 +7297,32 @@
         <w:rPr>
           <w:b/>
         </w:rPr>
-        <w:t xml:space="preserve">Wide/shallow lots swap rear and side setbacks: </w:t>
-      </w:r>
-      <w:r>
-        <w:t>the “rear edge = whichever edge's midpoint sits furthest from the front edge's midpoint” heuristic is only correct when a lot's width is less than ~1.73× its depth. Confirmed concretely on real Canada Bay addresses (e.g. a 43.8m-wide, ~13m-deep lot) where a side edge got clipped as “rear” (applying 0.9m where 6.0m was required) and vice versa. A parallelism-based guard was attempted, calibrated against the actual cached dataset, and found to fire on 89% of simple lots — unusable as a warning. Pulled back ou</w:t>
-      </w:r>
-      <w:r>
-        <w:t>t rather than ship noise; the underlying question (is this dataset genuinely skewed wide/shallow, or is front-edge detection itself unreliable for many real addresses) needs real investigation, not a quick threshold.</w:t>
+        <w:t xml:space="preserve">Wide/shallow </w:t>
+      </w:r>
+      <w:proofErr w:type="gramStart"/>
+      <w:r>
+        <w:rPr>
+          <w:b/>
+        </w:rPr>
+        <w:t>lots</w:t>
+      </w:r>
+      <w:proofErr w:type="gramEnd"/>
+      <w:r>
+        <w:rPr>
+          <w:b/>
+        </w:rPr>
+        <w:t xml:space="preserve"> swap rear and side setbacks: </w:t>
+      </w:r>
+      <w:r>
+        <w:t>the “rear edge = whichever edge's midpoint sits furthest from the front edge's midpoint” heuristic is only correct when a lot's width is less than ~1.73× its depth. Confirmed concretely on real Canada Bay addresses (e.g. a 43.8m-wide, ~13m-deep lot) where a side edge got clipped as “rear” (applying 0.9m where 6.0m was required) and vice versa. A parallelism-based guard was attempted, calibrated against the actual cached dataset, and found to fire on 89% of simple lots — unusable as a warning. Pulled back out rather than ship noise; the underlying question (is this dataset genuinely skewed wide/</w:t>
+      </w:r>
+      <w:proofErr w:type="gramStart"/>
+      <w:r>
+        <w:t>shallow, or</w:t>
+      </w:r>
+      <w:proofErr w:type="gramEnd"/>
+      <w:r>
+        <w:t xml:space="preserve"> is front-edge detection itself unreliable for many real addresses) needs real investigation, not a quick threshold.</w:t>
       </w:r>
     </w:p>
     <w:p>
@@ -6293,12 +7333,20 @@
         <w:rPr>
           <w:b/>
         </w:rPr>
-        <w:lastRenderedPageBreak/>
         <w:t xml:space="preserve">Complex/curved boundaries confuse edge detection entirely: </w:t>
       </w:r>
       <w:r>
-        <w:t xml:space="preserve">a real 100-vertex lot (a curved/waterfront cadastral boundary approximated by dozens of ~1.2m micro-segments) had the front-edge detector pick one of those micro-segments as “the front edge” — architecturally meaningless. This one is fixed: any lot boundary over 12 vertices now returns its envelope plus a clear warning rather than a silently-wrong number, surfaced through the API's </w:t>
-      </w:r>
+        <w:t xml:space="preserve">a real 100-vertex lot (a curved/waterfront cadastral boundary approximated by dozens of ~1.2m micro-segments) had the front-edge detector pick one of those micro-segments as “the front edge” — architecturally meaningless. This one is fixed: any lot boundary over 12 vertices now returns its envelope plus a clear warning rather than a </w:t>
+      </w:r>
+      <w:proofErr w:type="gramStart"/>
+      <w:r>
+        <w:t>silently-wrong</w:t>
+      </w:r>
+      <w:proofErr w:type="gramEnd"/>
+      <w:r>
+        <w:t xml:space="preserve"> number, surfaced through the API's </w:t>
+      </w:r>
+      <w:proofErr w:type="spellStart"/>
       <w:r>
         <w:rPr>
           <w:rFonts w:ascii="Consolas" w:hAnsi="Consolas"/>
@@ -6306,6 +7354,7 @@
         </w:rPr>
         <w:t>envelope_fallback_warnings</w:t>
       </w:r>
+      <w:proofErr w:type="spellEnd"/>
       <w:r>
         <w:t xml:space="preserve"> and a dedicated frontend banner.</w:t>
       </w:r>
@@ -6316,7 +7365,14 @@
       </w:pPr>
       <w:bookmarkStart w:id="19" w:name="_Toc235115199"/>
       <w:r>
-        <w:t>6.9 A Ground-Floor-Only Envelope Presented as a Full 3D Massing Constraint (Found and Disclosed)</w:t>
+        <w:lastRenderedPageBreak/>
+        <w:t>6.</w:t>
+      </w:r>
+      <w:r>
+        <w:t>11</w:t>
+      </w:r>
+      <w:r>
+        <w:t xml:space="preserve"> A Ground-Floor-Only Envelope Presented as a Full 3D Massing Constraint (Found and Disclosed)</w:t>
       </w:r>
       <w:bookmarkEnd w:id="19"/>
     </w:p>
@@ -6335,18 +7391,60 @@
           <w:rFonts w:ascii="Consolas" w:hAnsi="Consolas"/>
           <w:sz w:val="20"/>
         </w:rPr>
-        <w:t>_apply_directional_setbacks()</w:t>
-      </w:r>
-      <w:r>
-        <w:t xml:space="preserve"> only ever accepts front/rear/side(ground)/secondary setbacks — there is no parameter for the upper-storey side setback, and </w:t>
-      </w:r>
+        <w:t>_</w:t>
+      </w:r>
+      <w:proofErr w:type="spellStart"/>
       <w:r>
         <w:rPr>
           <w:rFonts w:ascii="Consolas" w:hAnsi="Consolas"/>
           <w:sz w:val="20"/>
         </w:rPr>
+        <w:t>apply_directional_</w:t>
+      </w:r>
+      <w:proofErr w:type="gramStart"/>
+      <w:r>
+        <w:rPr>
+          <w:rFonts w:ascii="Consolas" w:hAnsi="Consolas"/>
+          <w:sz w:val="20"/>
+        </w:rPr>
+        <w:t>setbacks</w:t>
+      </w:r>
+      <w:proofErr w:type="spellEnd"/>
+      <w:r>
+        <w:rPr>
+          <w:rFonts w:ascii="Consolas" w:hAnsi="Consolas"/>
+          <w:sz w:val="20"/>
+        </w:rPr>
+        <w:t>(</w:t>
+      </w:r>
+      <w:proofErr w:type="gramEnd"/>
+      <w:r>
+        <w:rPr>
+          <w:rFonts w:ascii="Consolas" w:hAnsi="Consolas"/>
+          <w:sz w:val="20"/>
+        </w:rPr>
+        <w:t>)</w:t>
+      </w:r>
+      <w:r>
+        <w:t xml:space="preserve"> only ever accepts front/rear/side(ground)/secondary setbacks — there is no parameter for the upper-</w:t>
+      </w:r>
+      <w:proofErr w:type="spellStart"/>
+      <w:r>
+        <w:t>storey</w:t>
+      </w:r>
+      <w:proofErr w:type="spellEnd"/>
+      <w:r>
+        <w:t xml:space="preserve"> side setback, and </w:t>
+      </w:r>
+      <w:proofErr w:type="spellStart"/>
+      <w:r>
+        <w:rPr>
+          <w:rFonts w:ascii="Consolas" w:hAnsi="Consolas"/>
+          <w:sz w:val="20"/>
+        </w:rPr>
         <w:t>height_plane</w:t>
       </w:r>
+      <w:proofErr w:type="spellEnd"/>
       <w:r>
         <w:t xml:space="preserve"> is never applied to the geometry at all. The “3D buildable envelope” the README and pitch materials describe is, in the actual returned polygon, a single flat ground-floor footprint extruded to a flat height — it does not step in for upper floors the way most DCPs require.</w:t>
       </w:r>
@@ -6364,6 +7462,7 @@
       <w:r>
         <w:t>rather than attempt a full stepped-massing rebuild (a real geometry project, not a quick fix), added an explicit disclaimer — in the API response (</w:t>
       </w:r>
+      <w:proofErr w:type="spellStart"/>
       <w:r>
         <w:rPr>
           <w:rFonts w:ascii="Consolas" w:hAnsi="Consolas"/>
@@ -6371,9 +7470,11 @@
         </w:rPr>
         <w:t>envelope_geometry_note</w:t>
       </w:r>
+      <w:proofErr w:type="spellEnd"/>
       <w:r>
         <w:t xml:space="preserve">) and a matching frontend banner — stating plainly that the shape is ground-floor-only and that </w:t>
       </w:r>
+      <w:proofErr w:type="spellStart"/>
       <w:r>
         <w:rPr>
           <w:rFonts w:ascii="Consolas" w:hAnsi="Consolas"/>
@@ -6381,9 +7482,11 @@
         </w:rPr>
         <w:t>side_setback_upper</w:t>
       </w:r>
+      <w:proofErr w:type="spellEnd"/>
       <w:r>
         <w:t>/</w:t>
       </w:r>
+      <w:proofErr w:type="spellStart"/>
       <w:r>
         <w:rPr>
           <w:rFonts w:ascii="Consolas" w:hAnsi="Consolas"/>
@@ -6391,6 +7494,7 @@
         </w:rPr>
         <w:t>height_plane</w:t>
       </w:r>
+      <w:proofErr w:type="spellEnd"/>
       <w:r>
         <w:t xml:space="preserve"> are cited separately but not yet applied to the geometry. Honest disclosure over silent overclaiming.</w:t>
       </w:r>
@@ -6527,7 +7631,35 @@
               <w:rPr>
                 <w:sz w:val="20"/>
               </w:rPr>
-              <w:t>Doing offset/area math directly in lon/lat degrees is only correct at the equator; a proper metric projection (6.3) is the only way to get real, latitude-independent accuracy.</w:t>
+              <w:t xml:space="preserve">Doing offset/area math directly in </w:t>
+            </w:r>
+            <w:proofErr w:type="spellStart"/>
+            <w:r>
+              <w:rPr>
+                <w:sz w:val="20"/>
+              </w:rPr>
+              <w:t>lon</w:t>
+            </w:r>
+            <w:proofErr w:type="spellEnd"/>
+            <w:r>
+              <w:rPr>
+                <w:sz w:val="20"/>
+              </w:rPr>
+              <w:t>/</w:t>
+            </w:r>
+            <w:proofErr w:type="spellStart"/>
+            <w:r>
+              <w:rPr>
+                <w:sz w:val="20"/>
+              </w:rPr>
+              <w:t>lat</w:t>
+            </w:r>
+            <w:proofErr w:type="spellEnd"/>
+            <w:r>
+              <w:rPr>
+                <w:sz w:val="20"/>
+              </w:rPr>
+              <w:t xml:space="preserve"> degrees is only correct at the equator; a proper metric projection (6.3) is the only way to get real, latitude-independent accuracy.</w:t>
             </w:r>
           </w:p>
         </w:tc>
@@ -6578,7 +7710,21 @@
               <w:rPr>
                 <w:sz w:val="20"/>
               </w:rPr>
-              <w:t>Council DCPs vary in structure but not in kind of variation (clause labels, heading conventions, section nesting) a structure-detection step generalises better than hardcoding each council's quirks, and is much less code to maintain.</w:t>
+              <w:t xml:space="preserve">Council DCPs vary in structure but not in kind of variation (clause labels, heading conventions, section nesting) a structure-detection step </w:t>
+            </w:r>
+            <w:proofErr w:type="spellStart"/>
+            <w:r>
+              <w:rPr>
+                <w:sz w:val="20"/>
+              </w:rPr>
+              <w:t>generalises</w:t>
+            </w:r>
+            <w:proofErr w:type="spellEnd"/>
+            <w:r>
+              <w:rPr>
+                <w:sz w:val="20"/>
+              </w:rPr>
+              <w:t xml:space="preserve"> better than hardcoding each council's quirks, and is much less code to maintain.</w:t>
             </w:r>
           </w:p>
         </w:tc>
@@ -6599,7 +7745,23 @@
                 <w:b w:val="0"/>
                 <w:sz w:val="20"/>
               </w:rPr>
-              <w:t>Gemini/Groq over Claude for extraction (as currently implemented)</w:t>
+              <w:t>Gemini/</w:t>
+            </w:r>
+            <w:proofErr w:type="spellStart"/>
+            <w:r>
+              <w:rPr>
+                <w:b w:val="0"/>
+                <w:sz w:val="20"/>
+              </w:rPr>
+              <w:t>Groq</w:t>
+            </w:r>
+            <w:proofErr w:type="spellEnd"/>
+            <w:r>
+              <w:rPr>
+                <w:b w:val="0"/>
+                <w:sz w:val="20"/>
+              </w:rPr>
+              <w:t xml:space="preserve"> over Claude for extraction (as currently implemented)</w:t>
             </w:r>
           </w:p>
         </w:tc>
@@ -6774,7 +7936,35 @@
               <w:rPr>
                 <w:sz w:val="20"/>
               </w:rPr>
-              <w:t>For a compliance tool, a confidently-wrong number is strictly worse than an honestly-flagged uncertain one</w:t>
+              <w:t xml:space="preserve">For a compliance tool, a </w:t>
+            </w:r>
+            <w:proofErr w:type="gramStart"/>
+            <w:r>
+              <w:rPr>
+                <w:sz w:val="20"/>
+              </w:rPr>
+              <w:t>confidently-wrong</w:t>
+            </w:r>
+            <w:proofErr w:type="gramEnd"/>
+            <w:r>
+              <w:rPr>
+                <w:sz w:val="20"/>
+              </w:rPr>
+              <w:t xml:space="preserve"> number is strictly worse than an </w:t>
+            </w:r>
+            <w:proofErr w:type="gramStart"/>
+            <w:r>
+              <w:rPr>
+                <w:sz w:val="20"/>
+              </w:rPr>
+              <w:t>honestly-flagged</w:t>
+            </w:r>
+            <w:proofErr w:type="gramEnd"/>
+            <w:r>
+              <w:rPr>
+                <w:sz w:val="20"/>
+              </w:rPr>
+              <w:t xml:space="preserve"> uncertain one</w:t>
             </w:r>
             <w:r>
               <w:rPr>
@@ -6836,22 +8026,27 @@
               <w:rPr>
                 <w:sz w:val="20"/>
               </w:rPr>
-              <w:t xml:space="preserve"> (with an explanatory README) rather than deleted outright, since this is a reversible, low-risk action appropriate for a wrap-up-and-document phase rather than a we're-certain-we'll-never-need-this phase.</w:t>
+              <w:t xml:space="preserve"> (with an explanatory README) rather than deleted outright, since this is a reversible, low-risk action appropriate for a wrap-up-and-document phase rather than </w:t>
+            </w:r>
+            <w:proofErr w:type="gramStart"/>
+            <w:r>
+              <w:rPr>
+                <w:sz w:val="20"/>
+              </w:rPr>
+              <w:t>a we're</w:t>
+            </w:r>
+            <w:proofErr w:type="gramEnd"/>
+            <w:r>
+              <w:rPr>
+                <w:sz w:val="20"/>
+              </w:rPr>
+              <w:t>-certain-we'll-never-need-this phase.</w:t>
             </w:r>
           </w:p>
         </w:tc>
       </w:tr>
     </w:tbl>
-    <w:p>
-      <w:pPr>
-        <w:spacing w:after="80"/>
-      </w:pPr>
-    </w:p>
-    <w:p>
-      <w:r>
-        <w:br w:type="page"/>
-      </w:r>
-    </w:p>
+    <w:p/>
     <w:p>
       <w:pPr>
         <w:pStyle w:val="Heading1"/>
@@ -6878,7 +8073,15 @@
         <w:spacing w:after="160"/>
       </w:pPr>
       <w:r>
-        <w:t>City of Canada Bay Council only; R1–R4 residential zones. Every other LGA returns a 404. Inner West (Marrickville/Ashfield) support existed briefly and was deliberately removed — not a bug, a scope decision.</w:t>
+        <w:t>City of Canada Bay Council only; R1–R4 residential zones. Every other LGA returns a 404. Inner West (</w:t>
+      </w:r>
+      <w:proofErr w:type="spellStart"/>
+      <w:r>
+        <w:t>Marrickville</w:t>
+      </w:r>
+      <w:proofErr w:type="spellEnd"/>
+      <w:r>
+        <w:t>/Ashfield) support existed briefly and was deliberately removed — not a bug, a scope decision.</w:t>
       </w:r>
     </w:p>
     <w:p>
@@ -6976,17 +8179,42 @@
           <w:rFonts w:ascii="Consolas" w:hAnsi="Consolas"/>
           <w:sz w:val="20"/>
         </w:rPr>
-        <w:t>/lmr</w:t>
-      </w:r>
-      <w:r>
-        <w:t>) and CDC (</w:t>
-      </w:r>
+        <w:t>/</w:t>
+      </w:r>
+      <w:proofErr w:type="spellStart"/>
       <w:r>
         <w:rPr>
           <w:rFonts w:ascii="Consolas" w:hAnsi="Consolas"/>
           <w:sz w:val="20"/>
         </w:rPr>
-        <w:t>/cdc-eligibility</w:t>
+        <w:t>lmr</w:t>
+      </w:r>
+      <w:proofErr w:type="spellEnd"/>
+      <w:r>
+        <w:t>) and CDC (</w:t>
+      </w:r>
+      <w:r>
+        <w:rPr>
+          <w:rFonts w:ascii="Consolas" w:hAnsi="Consolas"/>
+          <w:sz w:val="20"/>
+        </w:rPr>
+        <w:t>/</w:t>
+      </w:r>
+      <w:proofErr w:type="spellStart"/>
+      <w:r>
+        <w:rPr>
+          <w:rFonts w:ascii="Consolas" w:hAnsi="Consolas"/>
+          <w:sz w:val="20"/>
+        </w:rPr>
+        <w:t>cdc</w:t>
+      </w:r>
+      <w:proofErr w:type="spellEnd"/>
+      <w:r>
+        <w:rPr>
+          <w:rFonts w:ascii="Consolas" w:hAnsi="Consolas"/>
+          <w:sz w:val="20"/>
+        </w:rPr>
+        <w:t>-eligibility</w:t>
       </w:r>
       <w:r>
         <w:t>) are preliminary screens, not determinations — several statutory exclusions (bushfire, flood, TOD overlap, ANEF noise contours, etc.) aren't verified.</w:t>
@@ -7016,6 +8244,7 @@
         <w:pStyle w:val="ListBullet"/>
         <w:spacing w:after="80"/>
       </w:pPr>
+      <w:proofErr w:type="spellStart"/>
       <w:r>
         <w:rPr>
           <w:rFonts w:ascii="Consolas" w:hAnsi="Consolas"/>
@@ -7024,7 +8253,11 @@
         <w:t>pipeline.py</w:t>
       </w:r>
       <w:r>
-        <w:t>'s schema-invalid (“flagged”) rules aren't excluded from its output file</w:t>
+        <w:t>'s</w:t>
+      </w:r>
+      <w:proofErr w:type="spellEnd"/>
+      <w:r>
+        <w:t xml:space="preserve"> schema-invalid (“flagged”) rules aren't excluded from its output file</w:t>
       </w:r>
       <w:r>
         <w:t>,</w:t>
@@ -7055,7 +8288,23 @@
         <w:t>External, no key required:</w:t>
       </w:r>
       <w:r>
-        <w:t xml:space="preserve"> NSW ArcGIS Geocoder, NSW Six Maps Cadastre, NSW Planning spatial layers (zone/LGA/FSR/height/lot-size/heritage), NSW Transport road-segment layer, NSW SEPP_Housing_2021 Town Centres layer.</w:t>
+        <w:t xml:space="preserve"> NSW ArcGIS Geocoder, NSW Six Maps </w:t>
+      </w:r>
+      <w:proofErr w:type="spellStart"/>
+      <w:r>
+        <w:t>Cadastre</w:t>
+      </w:r>
+      <w:proofErr w:type="spellEnd"/>
+      <w:r>
+        <w:t xml:space="preserve">, NSW Planning spatial layers (zone/LGA/FSR/height/lot-size/heritage), NSW Transport road-segment layer, NSW SEPP_Housing_2021 Town </w:t>
+      </w:r>
+      <w:proofErr w:type="spellStart"/>
+      <w:r>
+        <w:t>Centres</w:t>
+      </w:r>
+      <w:proofErr w:type="spellEnd"/>
+      <w:r>
+        <w:t xml:space="preserve"> layer.</w:t>
       </w:r>
     </w:p>
     <w:p>
@@ -7097,16 +8346,28 @@
           <w:rFonts w:ascii="Consolas" w:hAnsi="Consolas"/>
           <w:sz w:val="20"/>
         </w:rPr>
-        <w:t>.env</w:t>
-      </w:r>
-      <w:r>
-        <w:t xml:space="preserve">) — only needed to re-run </w:t>
-      </w:r>
+        <w:t>.</w:t>
+      </w:r>
+      <w:proofErr w:type="gramStart"/>
       <w:r>
         <w:rPr>
           <w:rFonts w:ascii="Consolas" w:hAnsi="Consolas"/>
           <w:sz w:val="20"/>
         </w:rPr>
+        <w:t>env</w:t>
+      </w:r>
+      <w:r>
+        <w:t>) —</w:t>
+      </w:r>
+      <w:proofErr w:type="gramEnd"/>
+      <w:r>
+        <w:t xml:space="preserve"> only needed to re-run </w:t>
+      </w:r>
+      <w:r>
+        <w:rPr>
+          <w:rFonts w:ascii="Consolas" w:hAnsi="Consolas"/>
+          <w:sz w:val="20"/>
+        </w:rPr>
         <w:t>pipeline.py</w:t>
       </w:r>
       <w:r>
@@ -7125,7 +8386,23 @@
         <w:t>Backend:</w:t>
       </w:r>
       <w:r>
-        <w:t xml:space="preserve"> FastAPI, Shapely, PyMuPDF, pandas, requests.</w:t>
+        <w:t xml:space="preserve"> </w:t>
+      </w:r>
+      <w:proofErr w:type="spellStart"/>
+      <w:r>
+        <w:t>FastAPI</w:t>
+      </w:r>
+      <w:proofErr w:type="spellEnd"/>
+      <w:r>
+        <w:t xml:space="preserve">, Shapely, </w:t>
+      </w:r>
+      <w:proofErr w:type="spellStart"/>
+      <w:r>
+        <w:t>PyMuPDF</w:t>
+      </w:r>
+      <w:proofErr w:type="spellEnd"/>
+      <w:r>
+        <w:t>, pandas, requests.</w:t>
       </w:r>
     </w:p>
     <w:p>
@@ -7155,7 +8432,15 @@
         <w:t>Plugin:</w:t>
       </w:r>
       <w:r>
-        <w:t xml:space="preserve"> Rhino/Grasshopper (Python component), requires the backend running and reachable at </w:t>
+        <w:t xml:space="preserve"> </w:t>
+      </w:r>
+      <w:proofErr w:type="gramStart"/>
+      <w:r>
+        <w:t>Rhino/Grasshopper (Python component),</w:t>
+      </w:r>
+      <w:proofErr w:type="gramEnd"/>
+      <w:r>
+        <w:t xml:space="preserve"> requires the backend running and reachable at </w:t>
       </w:r>
       <w:r>
         <w:rPr>
@@ -7219,7 +8504,57 @@
           <w:szCs w:val="24"/>
         </w:rPr>
         <w:br/>
-        <w:t>uvicorn backend.main:app --reload --port 8000</w:t>
+      </w:r>
+      <w:proofErr w:type="spellStart"/>
+      <w:r>
+        <w:rPr>
+          <w:rFonts w:ascii="Consolas" w:hAnsi="Consolas"/>
+          <w:color w:val="333333"/>
+          <w:sz w:val="24"/>
+          <w:szCs w:val="24"/>
+        </w:rPr>
+        <w:t>uvicorn</w:t>
+      </w:r>
+      <w:proofErr w:type="spellEnd"/>
+      <w:r>
+        <w:rPr>
+          <w:rFonts w:ascii="Consolas" w:hAnsi="Consolas"/>
+          <w:color w:val="333333"/>
+          <w:sz w:val="24"/>
+          <w:szCs w:val="24"/>
+        </w:rPr>
+        <w:t xml:space="preserve"> </w:t>
+      </w:r>
+      <w:proofErr w:type="spellStart"/>
+      <w:proofErr w:type="gramStart"/>
+      <w:r>
+        <w:rPr>
+          <w:rFonts w:ascii="Consolas" w:hAnsi="Consolas"/>
+          <w:color w:val="333333"/>
+          <w:sz w:val="24"/>
+          <w:szCs w:val="24"/>
+        </w:rPr>
+        <w:t>backend.main</w:t>
+      </w:r>
+      <w:proofErr w:type="gramEnd"/>
+      <w:r>
+        <w:rPr>
+          <w:rFonts w:ascii="Consolas" w:hAnsi="Consolas"/>
+          <w:color w:val="333333"/>
+          <w:sz w:val="24"/>
+          <w:szCs w:val="24"/>
+        </w:rPr>
+        <w:t>:app</w:t>
+      </w:r>
+      <w:proofErr w:type="spellEnd"/>
+      <w:r>
+        <w:rPr>
+          <w:rFonts w:ascii="Consolas" w:hAnsi="Consolas"/>
+          <w:color w:val="333333"/>
+          <w:sz w:val="24"/>
+          <w:szCs w:val="24"/>
+        </w:rPr>
+        <w:t xml:space="preserve"> --reload --port 8000</w:t>
       </w:r>
     </w:p>
     <w:p>
@@ -7288,8 +8623,8 @@
           <w:szCs w:val="24"/>
         </w:rPr>
         <w:br/>
-        <w:t>npm install</w:t>
-      </w:r>
+      </w:r>
+      <w:proofErr w:type="spellStart"/>
       <w:r>
         <w:rPr>
           <w:rFonts w:ascii="Consolas" w:hAnsi="Consolas"/>
@@ -7297,8 +8632,46 @@
           <w:sz w:val="24"/>
           <w:szCs w:val="24"/>
         </w:rPr>
+        <w:t>npm</w:t>
+      </w:r>
+      <w:proofErr w:type="spellEnd"/>
+      <w:r>
+        <w:rPr>
+          <w:rFonts w:ascii="Consolas" w:hAnsi="Consolas"/>
+          <w:color w:val="333333"/>
+          <w:sz w:val="24"/>
+          <w:szCs w:val="24"/>
+        </w:rPr>
+        <w:t xml:space="preserve"> install</w:t>
+      </w:r>
+      <w:r>
+        <w:rPr>
+          <w:rFonts w:ascii="Consolas" w:hAnsi="Consolas"/>
+          <w:color w:val="333333"/>
+          <w:sz w:val="24"/>
+          <w:szCs w:val="24"/>
+        </w:rPr>
         <w:br/>
-        <w:t>npm run dev</w:t>
+      </w:r>
+      <w:proofErr w:type="spellStart"/>
+      <w:r>
+        <w:rPr>
+          <w:rFonts w:ascii="Consolas" w:hAnsi="Consolas"/>
+          <w:color w:val="333333"/>
+          <w:sz w:val="24"/>
+          <w:szCs w:val="24"/>
+        </w:rPr>
+        <w:t>npm</w:t>
+      </w:r>
+      <w:proofErr w:type="spellEnd"/>
+      <w:r>
+        <w:rPr>
+          <w:rFonts w:ascii="Consolas" w:hAnsi="Consolas"/>
+          <w:color w:val="333333"/>
+          <w:sz w:val="24"/>
+          <w:szCs w:val="24"/>
+        </w:rPr>
+        <w:t xml:space="preserve"> run dev</w:t>
       </w:r>
     </w:p>
     <w:p>
@@ -7457,8 +8830,9 @@
           <w:sz w:val="24"/>
           <w:szCs w:val="24"/>
         </w:rPr>
-        <w:t>python pipeline.py                          # all LGAs in pipeline_manifest.json (currently: Canada Bay only)</w:t>
-      </w:r>
+        <w:t xml:space="preserve">python pipeline.py                          # all LGAs in </w:t>
+      </w:r>
+      <w:proofErr w:type="spellStart"/>
       <w:r>
         <w:rPr>
           <w:rFonts w:ascii="Consolas" w:hAnsi="Consolas"/>
@@ -7466,8 +8840,58 @@
           <w:sz w:val="24"/>
           <w:szCs w:val="24"/>
         </w:rPr>
+        <w:t>pipeline_</w:t>
+      </w:r>
+      <w:proofErr w:type="gramStart"/>
+      <w:r>
+        <w:rPr>
+          <w:rFonts w:ascii="Consolas" w:hAnsi="Consolas"/>
+          <w:color w:val="333333"/>
+          <w:sz w:val="24"/>
+          <w:szCs w:val="24"/>
+        </w:rPr>
+        <w:t>manifest.json</w:t>
+      </w:r>
+      <w:proofErr w:type="spellEnd"/>
+      <w:proofErr w:type="gramEnd"/>
+      <w:r>
+        <w:rPr>
+          <w:rFonts w:ascii="Consolas" w:hAnsi="Consolas"/>
+          <w:color w:val="333333"/>
+          <w:sz w:val="24"/>
+          <w:szCs w:val="24"/>
+        </w:rPr>
+        <w:t xml:space="preserve"> (currently: Canada Bay only)</w:t>
+      </w:r>
+      <w:r>
+        <w:rPr>
+          <w:rFonts w:ascii="Consolas" w:hAnsi="Consolas"/>
+          <w:color w:val="333333"/>
+          <w:sz w:val="24"/>
+          <w:szCs w:val="24"/>
+        </w:rPr>
         <w:br/>
-        <w:t>python pipeline.py --lga "Canada Bay R3"     # one entry</w:t>
+        <w:t>python pipeline.py --</w:t>
+      </w:r>
+      <w:proofErr w:type="spellStart"/>
+      <w:r>
+        <w:rPr>
+          <w:rFonts w:ascii="Consolas" w:hAnsi="Consolas"/>
+          <w:color w:val="333333"/>
+          <w:sz w:val="24"/>
+          <w:szCs w:val="24"/>
+        </w:rPr>
+        <w:t>lga</w:t>
+      </w:r>
+      <w:proofErr w:type="spellEnd"/>
+      <w:r>
+        <w:rPr>
+          <w:rFonts w:ascii="Consolas" w:hAnsi="Consolas"/>
+          <w:color w:val="333333"/>
+          <w:sz w:val="24"/>
+          <w:szCs w:val="24"/>
+        </w:rPr>
+        <w:t xml:space="preserve"> "Canada Bay R3"     # one entry</w:t>
       </w:r>
     </w:p>
     <w:p>
@@ -7505,8 +8929,19 @@
           <w:szCs w:val="24"/>
         </w:rPr>
         <w:br/>
-        <w:t>python test_accuracy.py --skip-geometry     # skip the envelope-geometry check added</w:t>
-      </w:r>
+        <w:t xml:space="preserve">python test_accuracy.py --skip-geometry     # skip the envelope-geometry </w:t>
+      </w:r>
+      <w:proofErr w:type="gramStart"/>
+      <w:r>
+        <w:rPr>
+          <w:rFonts w:ascii="Consolas" w:hAnsi="Consolas"/>
+          <w:color w:val="333333"/>
+          <w:sz w:val="24"/>
+          <w:szCs w:val="24"/>
+        </w:rPr>
+        <w:t>check added</w:t>
+      </w:r>
+      <w:proofErr w:type="gramEnd"/>
       <w:r>
         <w:rPr>
           <w:rFonts w:ascii="Consolas" w:hAnsi="Consolas"/>
@@ -7588,11 +9023,19 @@
             <w:pPr>
               <w:cnfStyle w:val="100000000000" w:firstRow="1" w:lastRow="0" w:firstColumn="0" w:lastColumn="0" w:oddVBand="0" w:evenVBand="0" w:oddHBand="0" w:evenHBand="0" w:firstRowFirstColumn="0" w:firstRowLastColumn="0" w:lastRowFirstColumn="0" w:lastRowLastColumn="0"/>
             </w:pPr>
+            <w:proofErr w:type="gramStart"/>
             <w:r>
               <w:rPr>
                 <w:sz w:val="20"/>
               </w:rPr>
-              <w:t>Actually Verified Now</w:t>
+              <w:t>Actually</w:t>
+            </w:r>
+            <w:proofErr w:type="gramEnd"/>
+            <w:r>
+              <w:rPr>
+                <w:sz w:val="20"/>
+              </w:rPr>
+              <w:t xml:space="preserve"> Verified Now</w:t>
             </w:r>
           </w:p>
         </w:tc>
@@ -7902,8 +9345,17 @@
                 <w:sz w:val="24"/>
                 <w:szCs w:val="24"/>
               </w:rPr>
-              <w:t>66/70 cached</w:t>
-            </w:r>
+              <w:t xml:space="preserve">66/70 </w:t>
+            </w:r>
+            <w:proofErr w:type="gramStart"/>
+            <w:r>
+              <w:rPr>
+                <w:sz w:val="24"/>
+                <w:szCs w:val="24"/>
+              </w:rPr>
+              <w:t>cached</w:t>
+            </w:r>
+            <w:proofErr w:type="gramEnd"/>
             <w:r>
               <w:rPr>
                 <w:sz w:val="24"/>
@@ -8039,7 +9491,25 @@
                 <w:sz w:val="24"/>
                 <w:szCs w:val="24"/>
               </w:rPr>
-              <w:t xml:space="preserve"> setback distance correct (±0.3m/10%)</w:t>
+              <w:t xml:space="preserve"> setback distance </w:t>
+            </w:r>
+            <w:proofErr w:type="gramStart"/>
+            <w:r>
+              <w:rPr>
+                <w:b w:val="0"/>
+                <w:sz w:val="24"/>
+                <w:szCs w:val="24"/>
+              </w:rPr>
+              <w:t>correct</w:t>
+            </w:r>
+            <w:proofErr w:type="gramEnd"/>
+            <w:r>
+              <w:rPr>
+                <w:b w:val="0"/>
+                <w:sz w:val="24"/>
+                <w:szCs w:val="24"/>
+              </w:rPr>
+              <w:t xml:space="preserve"> (±0.3m/10%)</w:t>
             </w:r>
           </w:p>
         </w:tc>
@@ -8165,7 +9635,23 @@
                 <w:sz w:val="24"/>
                 <w:szCs w:val="24"/>
               </w:rPr>
-              <w:t>Gemini/Groq (Anthropic removed)</w:t>
+              <w:t>Gemini/</w:t>
+            </w:r>
+            <w:proofErr w:type="spellStart"/>
+            <w:r>
+              <w:rPr>
+                <w:sz w:val="24"/>
+                <w:szCs w:val="24"/>
+              </w:rPr>
+              <w:t>Groq</w:t>
+            </w:r>
+            <w:proofErr w:type="spellEnd"/>
+            <w:r>
+              <w:rPr>
+                <w:sz w:val="24"/>
+                <w:szCs w:val="24"/>
+              </w:rPr>
+              <w:t xml:space="preserve"> (Anthropic removed)</w:t>
             </w:r>
           </w:p>
         </w:tc>
@@ -8335,7 +9821,23 @@
           <w:sz w:val="24"/>
           <w:szCs w:val="24"/>
         </w:rPr>
-        <w:t xml:space="preserve"> (5, 11). The team correctly recognised they couldn't audit their own output without architectural/planning expertise and scaled down in response</w:t>
+        <w:t xml:space="preserve"> (5, 11). The team correctly </w:t>
+      </w:r>
+      <w:proofErr w:type="spellStart"/>
+      <w:r>
+        <w:rPr>
+          <w:sz w:val="24"/>
+          <w:szCs w:val="24"/>
+        </w:rPr>
+        <w:t>recognised</w:t>
+      </w:r>
+      <w:proofErr w:type="spellEnd"/>
+      <w:r>
+        <w:rPr>
+          <w:sz w:val="24"/>
+          <w:szCs w:val="24"/>
+        </w:rPr>
+        <w:t xml:space="preserve"> they couldn't audit their own output without architectural/planning expertise and scaled down in response</w:t>
       </w:r>
       <w:r>
         <w:rPr>

</xml_diff>